<commit_message>
feat: update surat undangan template to include dynamic placeholders for student and committee details
</commit_message>
<xml_diff>
--- a/src/templates/template_surat_undangan_sidang.docx
+++ b/src/templates/template_surat_undangan_sidang.docx
@@ -1,180 +1,360 @@
 
 <file path=word/document.xml><?xml version="1.0" encoding="utf-8"?>
-<w:document xmlns:wpc="http://schemas.microsoft.com/office/word/2010/wordprocessingCanvas" xmlns:cx="http://schemas.microsoft.com/office/drawing/2014/chartex" xmlns:cx1="http://schemas.microsoft.com/office/drawing/2015/9/8/chartex" xmlns:cx2="http://schemas.microsoft.com/office/drawing/2015/10/21/chartex" xmlns:cx3="http://schemas.microsoft.com/office/drawing/2016/5/9/chartex" xmlns:cx4="http://schemas.microsoft.com/office/drawing/2016/5/10/chartex" xmlns:cx5="http://schemas.microsoft.com/office/drawing/2016/5/11/chartex" xmlns:cx6="http://schemas.microsoft.com/office/drawing/2016/5/12/chartex" xmlns:cx7="http://schemas.microsoft.com/office/drawing/2016/5/13/chartex" xmlns:cx8="http://schemas.microsoft.com/office/drawing/2016/5/14/chartex" xmlns:mc="http://schemas.openxmlformats.org/markup-compatibility/2006" xmlns:aink="http://schemas.microsoft.com/office/drawing/2016/ink" xmlns:am3d="http://schemas.microsoft.com/office/drawing/2017/model3d" xmlns:o="urn:schemas-microsoft-com:office:office" xmlns:r="http://schemas.openxmlformats.org/officeDocument/2006/relationships" xmlns:m="http://schemas.openxmlformats.org/officeDocument/2006/math" xmlns:v="urn:schemas-microsoft-com:vml" xmlns:wp14="http://schemas.microsoft.com/office/word/2010/wordprocessingDrawing" xmlns:wp="http://schemas.openxmlformats.org/drawingml/2006/wordprocessingDrawing" xmlns:w10="urn:schemas-microsoft-com:office:word" xmlns:w="http://schemas.openxmlformats.org/wordprocessingml/2006/main" xmlns:w14="http://schemas.microsoft.com/office/word/2010/wordml" xmlns:w15="http://schemas.microsoft.com/office/word/2012/wordml" xmlns:w16cid="http://schemas.microsoft.com/office/word/2016/wordml/cid" xmlns:w16se="http://schemas.microsoft.com/office/word/2015/wordml/symex" xmlns:wpg="http://schemas.microsoft.com/office/word/2010/wordprocessingGroup" xmlns:wpi="http://schemas.microsoft.com/office/word/2010/wordprocessingInk" xmlns:wne="http://schemas.microsoft.com/office/word/2006/wordml" xmlns:wps="http://schemas.microsoft.com/office/word/2010/wordprocessingShape" mc:Ignorable="w14 w15 w16se w16cid wp14">
+<w:document xmlns:wpc="http://schemas.microsoft.com/office/word/2010/wordprocessingCanvas" xmlns:cx="http://schemas.microsoft.com/office/drawing/2014/chartex" xmlns:cx1="http://schemas.microsoft.com/office/drawing/2015/9/8/chartex" xmlns:cx2="http://schemas.microsoft.com/office/drawing/2015/10/21/chartex" xmlns:cx3="http://schemas.microsoft.com/office/drawing/2016/5/9/chartex" xmlns:cx4="http://schemas.microsoft.com/office/drawing/2016/5/10/chartex" xmlns:cx5="http://schemas.microsoft.com/office/drawing/2016/5/11/chartex" xmlns:cx6="http://schemas.microsoft.com/office/drawing/2016/5/12/chartex" xmlns:cx7="http://schemas.microsoft.com/office/drawing/2016/5/13/chartex" xmlns:cx8="http://schemas.microsoft.com/office/drawing/2016/5/14/chartex" xmlns:mc="http://schemas.openxmlformats.org/markup-compatibility/2006" xmlns:aink="http://schemas.microsoft.com/office/drawing/2016/ink" xmlns:am3d="http://schemas.microsoft.com/office/drawing/2017/model3d" xmlns:o="urn:schemas-microsoft-com:office:office" xmlns:oel="http://schemas.microsoft.com/office/2019/extlst" xmlns:r="http://schemas.openxmlformats.org/officeDocument/2006/relationships" xmlns:m="http://schemas.openxmlformats.org/officeDocument/2006/math" xmlns:v="urn:schemas-microsoft-com:vml" xmlns:wp14="http://schemas.microsoft.com/office/word/2010/wordprocessingDrawing" xmlns:wp="http://schemas.openxmlformats.org/drawingml/2006/wordprocessingDrawing" xmlns:w10="urn:schemas-microsoft-com:office:word" xmlns:w="http://schemas.openxmlformats.org/wordprocessingml/2006/main" xmlns:w14="http://schemas.microsoft.com/office/word/2010/wordml" xmlns:w15="http://schemas.microsoft.com/office/word/2012/wordml" xmlns:w16cex="http://schemas.microsoft.com/office/word/2018/wordml/cex" xmlns:w16cid="http://schemas.microsoft.com/office/word/2016/wordml/cid" xmlns:w16="http://schemas.microsoft.com/office/word/2018/wordml" xmlns:w16du="http://schemas.microsoft.com/office/word/2023/wordml/word16du" xmlns:w16sdtdh="http://schemas.microsoft.com/office/word/2020/wordml/sdtdatahash" xmlns:w16sdtfl="http://schemas.microsoft.com/office/word/2024/wordml/sdtformatlock" xmlns:w16se="http://schemas.microsoft.com/office/word/2015/wordml/symex" xmlns:wpg="http://schemas.microsoft.com/office/word/2010/wordprocessingGroup" xmlns:wpi="http://schemas.microsoft.com/office/word/2010/wordprocessingInk" xmlns:wne="http://schemas.microsoft.com/office/word/2006/wordml" xmlns:wps="http://schemas.microsoft.com/office/word/2010/wordprocessingShape" mc:Ignorable="w14 w15 w16se w16cid w16 w16cex w16sdtdh w16sdtfl w16du wp14">
   <w:body>
-    <w:p>
-      <w:pPr>
-        <w:spacing w:after="0" w:line="240" w:lineRule="auto"/>
-        <w:rPr>
-          <w:rFonts w:ascii="Times New Roman" w:hAnsi="Times New Roman" w:cs="Times New Roman"/>
-          <w:sz w:val="24"/>
-          <w:szCs w:val="24"/>
-          <w:lang w:val="id-ID"/>
-        </w:rPr>
-      </w:pPr>
-      <w:r>
-        <w:rPr>
-          <w:rFonts w:ascii="Times New Roman" w:hAnsi="Times New Roman" w:cs="Times New Roman"/>
-          <w:sz w:val="24"/>
-          <w:szCs w:val="24"/>
-        </w:rPr>
-        <w:t>Nomor</w:t>
-      </w:r>
-      <w:r>
-        <w:rPr>
-          <w:rFonts w:ascii="Times New Roman" w:hAnsi="Times New Roman" w:cs="Times New Roman"/>
-          <w:sz w:val="24"/>
-          <w:szCs w:val="24"/>
-        </w:rPr>
-        <w:tab/>
-        <w:t>:</w:t>
-      </w:r>
-      <w:r>
-        <w:rPr>
-          <w:rFonts w:ascii="Times New Roman" w:hAnsi="Times New Roman" w:cs="Times New Roman"/>
-          <w:sz w:val="24"/>
-          <w:szCs w:val="24"/>
-        </w:rPr>
-        <w:tab/>
-      </w:r>
-      <w:r>
-        <w:rPr>
-          <w:rFonts w:ascii="Times New Roman" w:hAnsi="Times New Roman" w:cs="Times New Roman"/>
-          <w:sz w:val="24"/>
-          <w:szCs w:val="24"/>
-        </w:rPr>
-        <w:tab/>
-      </w:r>
-      <w:r>
-        <w:rPr>
-          <w:rFonts w:ascii="Times New Roman" w:hAnsi="Times New Roman" w:cs="Times New Roman"/>
-          <w:sz w:val="24"/>
-          <w:szCs w:val="24"/>
-        </w:rPr>
-        <w:tab/>
-      </w:r>
-      <w:r>
-        <w:rPr>
-          <w:rFonts w:ascii="Times New Roman" w:hAnsi="Times New Roman" w:cs="Times New Roman"/>
-          <w:sz w:val="24"/>
-          <w:szCs w:val="24"/>
-        </w:rPr>
-        <w:tab/>
-      </w:r>
-      <w:r>
-        <w:rPr>
-          <w:rFonts w:ascii="Times New Roman" w:hAnsi="Times New Roman" w:cs="Times New Roman"/>
-          <w:sz w:val="24"/>
-          <w:szCs w:val="24"/>
-        </w:rPr>
-        <w:tab/>
-      </w:r>
-      <w:r>
-        <w:rPr>
-          <w:rFonts w:ascii="Times New Roman" w:hAnsi="Times New Roman" w:cs="Times New Roman"/>
-          <w:sz w:val="24"/>
-          <w:szCs w:val="24"/>
-        </w:rPr>
-        <w:tab/>
-      </w:r>
-      <w:r>
-        <w:rPr>
-          <w:rFonts w:ascii="Times New Roman" w:hAnsi="Times New Roman" w:cs="Times New Roman"/>
-          <w:sz w:val="24"/>
-          <w:szCs w:val="24"/>
-        </w:rPr>
-        <w:tab/>
-      </w:r>
-      <w:r>
-        <w:rPr>
-          <w:rFonts w:ascii="Times New Roman" w:hAnsi="Times New Roman" w:cs="Times New Roman"/>
-          <w:sz w:val="24"/>
-          <w:szCs w:val="24"/>
-        </w:rPr>
-        <w:tab/>
-      </w:r>
-      <w:r>
-        <w:rPr>
-          <w:rFonts w:ascii="Times New Roman" w:hAnsi="Times New Roman" w:cs="Times New Roman"/>
-          <w:sz w:val="24"/>
-          <w:szCs w:val="24"/>
-        </w:rPr>
-        <w:tab/>
-      </w:r>
-      <w:r>
-        <w:rPr>
-          <w:rFonts w:ascii="Times New Roman" w:hAnsi="Times New Roman" w:cs="Times New Roman"/>
-          <w:sz w:val="24"/>
-          <w:szCs w:val="24"/>
-          <w:lang w:val="id-ID"/>
-        </w:rPr>
-        <w:t xml:space="preserve"> </w:t>
-      </w:r>
-      <w:r>
-        <w:rPr>
-          <w:rFonts w:ascii="Times New Roman" w:hAnsi="Times New Roman" w:cs="Times New Roman"/>
-          <w:sz w:val="24"/>
-          <w:szCs w:val="24"/>
-          <w:lang w:val="en-US"/>
-        </w:rPr>
-        <w:t xml:space="preserve">         </w:t>
-      </w:r>
-      <w:r>
-        <w:rPr>
-          <w:rFonts w:ascii="Times New Roman" w:hAnsi="Times New Roman" w:cs="Times New Roman"/>
-          <w:sz w:val="24"/>
-          <w:szCs w:val="24"/>
-          <w:lang w:val="id-ID"/>
-        </w:rPr>
-        <w:t xml:space="preserve">   </w:t>
-      </w:r>
-      <w:r>
-        <w:rPr>
-          <w:rFonts w:ascii="Times New Roman" w:hAnsi="Times New Roman" w:cs="Times New Roman"/>
-          <w:sz w:val="24"/>
-          <w:szCs w:val="24"/>
-          <w:lang w:val="en-US"/>
-        </w:rPr>
-        <w:t xml:space="preserve"> </w:t>
-      </w:r>
-      <w:r>
-        <w:rPr>
-          <w:rFonts w:ascii="Times New Roman" w:hAnsi="Times New Roman" w:cs="Times New Roman"/>
-          <w:sz w:val="24"/>
-          <w:szCs w:val="24"/>
-          <w:lang w:val="en-US"/>
-        </w:rPr>
-        <w:t xml:space="preserve"> DD MMM YYYY</w:t>
-      </w:r>
-    </w:p>
-    <w:p>
-      <w:pPr>
-        <w:spacing w:after="0" w:line="240" w:lineRule="auto"/>
-        <w:rPr>
-          <w:rFonts w:ascii="Times New Roman" w:hAnsi="Times New Roman" w:cs="Times New Roman"/>
-          <w:sz w:val="24"/>
-          <w:szCs w:val="24"/>
-          <w:lang w:val="id-ID"/>
-        </w:rPr>
-      </w:pPr>
-      <w:r>
-        <w:rPr>
-          <w:rFonts w:ascii="Times New Roman" w:hAnsi="Times New Roman" w:cs="Times New Roman"/>
-          <w:sz w:val="24"/>
-          <w:szCs w:val="24"/>
-        </w:rPr>
-        <w:t>Lamp</w:t>
-      </w:r>
-      <w:r>
-        <w:rPr>
-          <w:rFonts w:ascii="Times New Roman" w:hAnsi="Times New Roman" w:cs="Times New Roman"/>
-          <w:sz w:val="24"/>
-          <w:szCs w:val="24"/>
-        </w:rPr>
-        <w:tab/>
-        <w:t xml:space="preserve">: </w:t>
-      </w:r>
-    </w:p>
+    <w:tbl>
+      <w:tblPr>
+        <w:tblStyle w:val="TableGrid"/>
+        <w:tblW w:w="10207" w:type="dxa"/>
+        <w:tblInd w:w="-142" w:type="dxa"/>
+        <w:tblBorders>
+          <w:top w:val="none" w:sz="0" w:space="0" w:color="auto"/>
+          <w:left w:val="none" w:sz="0" w:space="0" w:color="auto"/>
+          <w:bottom w:val="none" w:sz="0" w:space="0" w:color="auto"/>
+          <w:right w:val="none" w:sz="0" w:space="0" w:color="auto"/>
+          <w:insideH w:val="none" w:sz="0" w:space="0" w:color="auto"/>
+          <w:insideV w:val="none" w:sz="0" w:space="0" w:color="auto"/>
+        </w:tblBorders>
+        <w:tblLook w:val="04A0" w:firstRow="1" w:lastRow="0" w:firstColumn="1" w:lastColumn="0" w:noHBand="0" w:noVBand="1"/>
+      </w:tblPr>
+      <w:tblGrid>
+        <w:gridCol w:w="1038"/>
+        <w:gridCol w:w="283"/>
+        <w:gridCol w:w="5792"/>
+        <w:gridCol w:w="3094"/>
+      </w:tblGrid>
+      <w:tr>
+        <w:tc>
+          <w:tcPr>
+            <w:tcW w:w="1038" w:type="dxa"/>
+          </w:tcPr>
+          <w:p>
+            <w:pPr>
+              <w:rPr>
+                <w:rFonts w:ascii="Times New Roman" w:hAnsi="Times New Roman" w:cs="Times New Roman"/>
+                <w:sz w:val="24"/>
+                <w:szCs w:val="24"/>
+              </w:rPr>
+            </w:pPr>
+            <w:proofErr w:type="spellStart"/>
+            <w:r>
+              <w:rPr>
+                <w:rFonts w:ascii="Times New Roman" w:hAnsi="Times New Roman" w:cs="Times New Roman"/>
+                <w:sz w:val="24"/>
+                <w:szCs w:val="24"/>
+              </w:rPr>
+              <w:t>Nomor</w:t>
+            </w:r>
+            <w:proofErr w:type="spellEnd"/>
+          </w:p>
+        </w:tc>
+        <w:tc>
+          <w:tcPr>
+            <w:tcW w:w="283" w:type="dxa"/>
+          </w:tcPr>
+          <w:p>
+            <w:pPr>
+              <w:rPr>
+                <w:rFonts w:ascii="Times New Roman" w:hAnsi="Times New Roman" w:cs="Times New Roman"/>
+                <w:sz w:val="24"/>
+                <w:szCs w:val="24"/>
+              </w:rPr>
+            </w:pPr>
+            <w:r>
+              <w:rPr>
+                <w:rFonts w:ascii="Times New Roman" w:hAnsi="Times New Roman" w:cs="Times New Roman"/>
+                <w:sz w:val="24"/>
+                <w:szCs w:val="24"/>
+              </w:rPr>
+              <w:t>:</w:t>
+            </w:r>
+          </w:p>
+        </w:tc>
+        <w:tc>
+          <w:tcPr>
+            <w:tcW w:w="5792" w:type="dxa"/>
+          </w:tcPr>
+          <w:p>
+            <w:pPr>
+              <w:rPr>
+                <w:rFonts w:ascii="Times New Roman" w:hAnsi="Times New Roman" w:cs="Times New Roman"/>
+                <w:sz w:val="24"/>
+                <w:szCs w:val="24"/>
+                <w:lang w:val="en-US"/>
+              </w:rPr>
+            </w:pPr>
+            <w:r>
+              <w:rPr>
+                <w:rFonts w:ascii="Times New Roman" w:hAnsi="Times New Roman" w:cs="Times New Roman"/>
+                <w:sz w:val="24"/>
+                <w:szCs w:val="24"/>
+                <w:lang w:val="en-US"/>
+              </w:rPr>
+              <w:t>{{</w:t>
+            </w:r>
+            <w:proofErr w:type="spellStart"/>
+            <w:r>
+              <w:rPr>
+                <w:rFonts w:ascii="Times New Roman" w:hAnsi="Times New Roman" w:cs="Times New Roman"/>
+                <w:sz w:val="24"/>
+                <w:szCs w:val="24"/>
+                <w:lang w:val="en-US"/>
+              </w:rPr>
+              <w:t>nomor_surat</w:t>
+            </w:r>
+            <w:proofErr w:type="spellEnd"/>
+            <w:r>
+              <w:rPr>
+                <w:rFonts w:ascii="Times New Roman" w:hAnsi="Times New Roman" w:cs="Times New Roman"/>
+                <w:sz w:val="24"/>
+                <w:szCs w:val="24"/>
+                <w:lang w:val="en-US"/>
+              </w:rPr>
+              <w:t>}}</w:t>
+            </w:r>
+          </w:p>
+        </w:tc>
+        <w:tc>
+          <w:tcPr>
+            <w:tcW w:w="3094" w:type="dxa"/>
+          </w:tcPr>
+          <w:p>
+            <w:pPr>
+              <w:jc w:val="right"/>
+              <w:rPr>
+                <w:rFonts w:ascii="Times New Roman" w:hAnsi="Times New Roman" w:cs="Times New Roman"/>
+                <w:sz w:val="24"/>
+                <w:szCs w:val="24"/>
+              </w:rPr>
+            </w:pPr>
+            <w:r>
+              <w:rPr>
+                <w:rFonts w:ascii="Times New Roman" w:hAnsi="Times New Roman" w:cs="Times New Roman"/>
+                <w:sz w:val="24"/>
+                <w:szCs w:val="24"/>
+                <w:lang w:val="en-US"/>
+              </w:rPr>
+              <w:t>{{</w:t>
+            </w:r>
+            <w:proofErr w:type="spellStart"/>
+            <w:r>
+              <w:rPr>
+                <w:rFonts w:ascii="Times New Roman" w:hAnsi="Times New Roman" w:cs="Times New Roman"/>
+                <w:sz w:val="24"/>
+                <w:szCs w:val="24"/>
+                <w:lang w:val="en-US"/>
+              </w:rPr>
+              <w:t>tanggal</w:t>
+            </w:r>
+            <w:proofErr w:type="spellEnd"/>
+            <w:r>
+              <w:rPr>
+                <w:rFonts w:ascii="Times New Roman" w:hAnsi="Times New Roman" w:cs="Times New Roman"/>
+                <w:sz w:val="24"/>
+                <w:szCs w:val="24"/>
+                <w:lang w:val="en-US"/>
+              </w:rPr>
+              <w:t>}}</w:t>
+            </w:r>
+          </w:p>
+        </w:tc>
+      </w:tr>
+      <w:tr>
+        <w:tc>
+          <w:tcPr>
+            <w:tcW w:w="1038" w:type="dxa"/>
+          </w:tcPr>
+          <w:p>
+            <w:pPr>
+              <w:rPr>
+                <w:rFonts w:ascii="Times New Roman" w:hAnsi="Times New Roman" w:cs="Times New Roman"/>
+                <w:sz w:val="24"/>
+                <w:szCs w:val="24"/>
+              </w:rPr>
+            </w:pPr>
+            <w:r>
+              <w:rPr>
+                <w:rFonts w:ascii="Times New Roman" w:hAnsi="Times New Roman" w:cs="Times New Roman"/>
+                <w:sz w:val="24"/>
+                <w:szCs w:val="24"/>
+              </w:rPr>
+              <w:t>Lamp</w:t>
+            </w:r>
+          </w:p>
+        </w:tc>
+        <w:tc>
+          <w:tcPr>
+            <w:tcW w:w="283" w:type="dxa"/>
+          </w:tcPr>
+          <w:p>
+            <w:pPr>
+              <w:rPr>
+                <w:rFonts w:ascii="Times New Roman" w:hAnsi="Times New Roman" w:cs="Times New Roman"/>
+                <w:sz w:val="24"/>
+                <w:szCs w:val="24"/>
+              </w:rPr>
+            </w:pPr>
+            <w:r>
+              <w:rPr>
+                <w:rFonts w:ascii="Times New Roman" w:hAnsi="Times New Roman" w:cs="Times New Roman"/>
+                <w:sz w:val="24"/>
+                <w:szCs w:val="24"/>
+              </w:rPr>
+              <w:t>:</w:t>
+            </w:r>
+          </w:p>
+        </w:tc>
+        <w:tc>
+          <w:tcPr>
+            <w:tcW w:w="5792" w:type="dxa"/>
+          </w:tcPr>
+          <w:p>
+            <w:pPr>
+              <w:rPr>
+                <w:rFonts w:ascii="Times New Roman" w:hAnsi="Times New Roman" w:cs="Times New Roman"/>
+                <w:sz w:val="24"/>
+                <w:szCs w:val="24"/>
+              </w:rPr>
+            </w:pPr>
+            <w:r>
+              <w:rPr>
+                <w:rFonts w:ascii="Times New Roman" w:hAnsi="Times New Roman" w:cs="Times New Roman"/>
+                <w:sz w:val="24"/>
+                <w:szCs w:val="24"/>
+              </w:rPr>
+              <w:t>{{</w:t>
+            </w:r>
+            <w:proofErr w:type="spellStart"/>
+            <w:r>
+              <w:rPr>
+                <w:rFonts w:ascii="Times New Roman" w:hAnsi="Times New Roman" w:cs="Times New Roman"/>
+                <w:sz w:val="24"/>
+                <w:szCs w:val="24"/>
+              </w:rPr>
+              <w:t>lampiran</w:t>
+            </w:r>
+            <w:proofErr w:type="spellEnd"/>
+            <w:r>
+              <w:rPr>
+                <w:rFonts w:ascii="Times New Roman" w:hAnsi="Times New Roman" w:cs="Times New Roman"/>
+                <w:sz w:val="24"/>
+                <w:szCs w:val="24"/>
+              </w:rPr>
+              <w:t>}}</w:t>
+            </w:r>
+          </w:p>
+        </w:tc>
+        <w:tc>
+          <w:tcPr>
+            <w:tcW w:w="3094" w:type="dxa"/>
+          </w:tcPr>
+          <w:p>
+            <w:pPr>
+              <w:rPr>
+                <w:rFonts w:ascii="Times New Roman" w:hAnsi="Times New Roman" w:cs="Times New Roman"/>
+                <w:sz w:val="24"/>
+                <w:szCs w:val="24"/>
+              </w:rPr>
+            </w:pPr>
+          </w:p>
+        </w:tc>
+      </w:tr>
+      <w:tr>
+        <w:trPr>
+          <w:trHeight w:val="47"/>
+        </w:trPr>
+        <w:tc>
+          <w:tcPr>
+            <w:tcW w:w="1038" w:type="dxa"/>
+          </w:tcPr>
+          <w:p>
+            <w:pPr>
+              <w:rPr>
+                <w:rFonts w:ascii="Times New Roman" w:hAnsi="Times New Roman" w:cs="Times New Roman"/>
+                <w:sz w:val="24"/>
+                <w:szCs w:val="24"/>
+              </w:rPr>
+            </w:pPr>
+            <w:r>
+              <w:rPr>
+                <w:rFonts w:ascii="Times New Roman" w:hAnsi="Times New Roman" w:cs="Times New Roman"/>
+                <w:sz w:val="24"/>
+                <w:szCs w:val="24"/>
+              </w:rPr>
+              <w:t>Hal</w:t>
+            </w:r>
+          </w:p>
+        </w:tc>
+        <w:tc>
+          <w:tcPr>
+            <w:tcW w:w="283" w:type="dxa"/>
+          </w:tcPr>
+          <w:p>
+            <w:pPr>
+              <w:rPr>
+                <w:rFonts w:ascii="Times New Roman" w:hAnsi="Times New Roman" w:cs="Times New Roman"/>
+                <w:sz w:val="24"/>
+                <w:szCs w:val="24"/>
+              </w:rPr>
+            </w:pPr>
+            <w:r>
+              <w:rPr>
+                <w:rFonts w:ascii="Times New Roman" w:hAnsi="Times New Roman" w:cs="Times New Roman"/>
+                <w:sz w:val="24"/>
+                <w:szCs w:val="24"/>
+              </w:rPr>
+              <w:t>:</w:t>
+            </w:r>
+          </w:p>
+        </w:tc>
+        <w:tc>
+          <w:tcPr>
+            <w:tcW w:w="5792" w:type="dxa"/>
+          </w:tcPr>
+          <w:p>
+            <w:pPr>
+              <w:rPr>
+                <w:rFonts w:ascii="Times New Roman" w:hAnsi="Times New Roman" w:cs="Times New Roman"/>
+                <w:sz w:val="24"/>
+                <w:szCs w:val="24"/>
+              </w:rPr>
+            </w:pPr>
+            <w:proofErr w:type="spellStart"/>
+            <w:r>
+              <w:rPr>
+                <w:rFonts w:ascii="Times New Roman" w:hAnsi="Times New Roman" w:cs="Times New Roman"/>
+                <w:sz w:val="24"/>
+                <w:szCs w:val="24"/>
+              </w:rPr>
+              <w:t>Ujian</w:t>
+            </w:r>
+            <w:proofErr w:type="spellEnd"/>
+            <w:r>
+              <w:rPr>
+                <w:rFonts w:ascii="Times New Roman" w:hAnsi="Times New Roman" w:cs="Times New Roman"/>
+                <w:sz w:val="24"/>
+                <w:szCs w:val="24"/>
+              </w:rPr>
+              <w:t xml:space="preserve"> Sarjana</w:t>
+            </w:r>
+          </w:p>
+        </w:tc>
+        <w:tc>
+          <w:tcPr>
+            <w:tcW w:w="3094" w:type="dxa"/>
+          </w:tcPr>
+          <w:p>
+            <w:pPr>
+              <w:rPr>
+                <w:rFonts w:ascii="Times New Roman" w:hAnsi="Times New Roman" w:cs="Times New Roman"/>
+                <w:sz w:val="24"/>
+                <w:szCs w:val="24"/>
+              </w:rPr>
+            </w:pPr>
+          </w:p>
+        </w:tc>
+      </w:tr>
+    </w:tbl>
     <w:p>
       <w:pPr>
         <w:tabs>
@@ -187,38 +367,9 @@
           <w:szCs w:val="24"/>
         </w:rPr>
       </w:pPr>
-      <w:r>
-        <w:rPr>
-          <w:rFonts w:ascii="Times New Roman" w:hAnsi="Times New Roman" w:cs="Times New Roman"/>
-          <w:sz w:val="24"/>
-          <w:szCs w:val="24"/>
-        </w:rPr>
-        <w:t>H a l</w:t>
-      </w:r>
-      <w:r>
-        <w:rPr>
-          <w:rFonts w:ascii="Times New Roman" w:hAnsi="Times New Roman" w:cs="Times New Roman"/>
-          <w:sz w:val="24"/>
-          <w:szCs w:val="24"/>
-        </w:rPr>
-        <w:tab/>
-        <w:t xml:space="preserve">: </w:t>
-      </w:r>
-      <w:r>
-        <w:rPr>
-          <w:rFonts w:ascii="Times New Roman" w:hAnsi="Times New Roman" w:cs="Times New Roman"/>
-          <w:sz w:val="24"/>
-          <w:szCs w:val="24"/>
-          <w:u w:val="single"/>
-        </w:rPr>
-        <w:t>Ujian Sarjana</w:t>
-      </w:r>
     </w:p>
     <w:p>
       <w:pPr>
-        <w:tabs>
-          <w:tab w:val="left" w:pos="720"/>
-        </w:tabs>
         <w:spacing w:after="0" w:line="240" w:lineRule="auto"/>
         <w:rPr>
           <w:rFonts w:ascii="Times New Roman" w:hAnsi="Times New Roman" w:cs="Times New Roman"/>
@@ -226,23 +377,72 @@
           <w:szCs w:val="24"/>
         </w:rPr>
       </w:pPr>
+      <w:proofErr w:type="spellStart"/>
+      <w:r>
+        <w:rPr>
+          <w:rFonts w:ascii="Times New Roman" w:hAnsi="Times New Roman" w:cs="Times New Roman"/>
+          <w:sz w:val="24"/>
+          <w:szCs w:val="24"/>
+        </w:rPr>
+        <w:t>Kepada</w:t>
+      </w:r>
+      <w:proofErr w:type="spellEnd"/>
+      <w:r>
+        <w:rPr>
+          <w:rFonts w:ascii="Times New Roman" w:hAnsi="Times New Roman" w:cs="Times New Roman"/>
+          <w:sz w:val="24"/>
+          <w:szCs w:val="24"/>
+        </w:rPr>
+        <w:t xml:space="preserve"> </w:t>
+      </w:r>
+      <w:proofErr w:type="spellStart"/>
+      <w:r>
+        <w:rPr>
+          <w:rFonts w:ascii="Times New Roman" w:hAnsi="Times New Roman" w:cs="Times New Roman"/>
+          <w:sz w:val="24"/>
+          <w:szCs w:val="24"/>
+        </w:rPr>
+        <w:t>Yth</w:t>
+      </w:r>
+      <w:proofErr w:type="spellEnd"/>
+      <w:proofErr w:type="gramStart"/>
+      <w:r>
+        <w:rPr>
+          <w:rFonts w:ascii="Times New Roman" w:hAnsi="Times New Roman" w:cs="Times New Roman"/>
+          <w:sz w:val="24"/>
+          <w:szCs w:val="24"/>
+        </w:rPr>
+        <w:t>. :</w:t>
+      </w:r>
+      <w:proofErr w:type="gramEnd"/>
     </w:p>
     <w:p>
       <w:pPr>
         <w:spacing w:after="0" w:line="240" w:lineRule="auto"/>
         <w:rPr>
           <w:rFonts w:ascii="Times New Roman" w:hAnsi="Times New Roman" w:cs="Times New Roman"/>
-          <w:sz w:val="24"/>
-          <w:szCs w:val="24"/>
-        </w:rPr>
-      </w:pPr>
-      <w:r>
-        <w:rPr>
-          <w:rFonts w:ascii="Times New Roman" w:hAnsi="Times New Roman" w:cs="Times New Roman"/>
-          <w:sz w:val="24"/>
-          <w:szCs w:val="24"/>
-        </w:rPr>
-        <w:t>Kepada Yth. :</w:t>
+          <w:b/>
+          <w:sz w:val="24"/>
+          <w:szCs w:val="24"/>
+        </w:rPr>
+      </w:pPr>
+      <w:r>
+        <w:rPr>
+          <w:rFonts w:ascii="Times New Roman" w:hAnsi="Times New Roman" w:cs="Times New Roman"/>
+          <w:b/>
+          <w:sz w:val="24"/>
+          <w:szCs w:val="24"/>
+        </w:rPr>
+        <w:t xml:space="preserve">1. </w:t>
+      </w:r>
+      <w:r>
+        <w:rPr>
+          <w:rFonts w:ascii="Times New Roman" w:hAnsi="Times New Roman" w:cs="Times New Roman"/>
+          <w:b/>
+          <w:sz w:val="24"/>
+          <w:szCs w:val="24"/>
+        </w:rPr>
+        <w:t>{{nama_pembimbing1}}</w:t>
       </w:r>
     </w:p>
     <w:p>
@@ -262,7 +462,7 @@
           <w:sz w:val="24"/>
           <w:szCs w:val="24"/>
         </w:rPr>
-        <w:t xml:space="preserve">1. </w:t>
+        <w:t xml:space="preserve">2. </w:t>
       </w:r>
       <w:r>
         <w:rPr>
@@ -271,7 +471,7 @@
           <w:sz w:val="24"/>
           <w:szCs w:val="24"/>
         </w:rPr>
-        <w:t>&lt;&lt;Nama Pembimbing Utama&gt;&gt;</w:t>
+        <w:t>{{nama_pembimbing2}}</w:t>
       </w:r>
     </w:p>
     <w:p>
@@ -291,7 +491,7 @@
           <w:sz w:val="24"/>
           <w:szCs w:val="24"/>
         </w:rPr>
-        <w:t xml:space="preserve">2. </w:t>
+        <w:t xml:space="preserve">3. </w:t>
       </w:r>
       <w:r>
         <w:rPr>
@@ -300,7 +500,7 @@
           <w:sz w:val="24"/>
           <w:szCs w:val="24"/>
         </w:rPr>
-        <w:t>&lt;&lt;Nama Pembimbing Kedua&gt;&gt;</w:t>
+        <w:t>{{nama_penguji1}}</w:t>
       </w:r>
     </w:p>
     <w:p>
@@ -308,11 +508,19 @@
         <w:spacing w:after="0" w:line="240" w:lineRule="auto"/>
         <w:rPr>
           <w:rFonts w:ascii="Times New Roman" w:hAnsi="Times New Roman" w:cs="Times New Roman"/>
+          <w:sz w:val="24"/>
+          <w:szCs w:val="24"/>
+        </w:rPr>
+      </w:pPr>
+      <w:r>
+        <w:rPr>
+          <w:rFonts w:ascii="Times New Roman" w:hAnsi="Times New Roman" w:cs="Times New Roman"/>
           <w:b/>
           <w:sz w:val="24"/>
           <w:szCs w:val="24"/>
         </w:rPr>
-      </w:pPr>
+        <w:t xml:space="preserve">4. </w:t>
+      </w:r>
       <w:r>
         <w:rPr>
           <w:rFonts w:ascii="Times New Roman" w:hAnsi="Times New Roman" w:cs="Times New Roman"/>
@@ -320,44 +528,7 @@
           <w:sz w:val="24"/>
           <w:szCs w:val="24"/>
         </w:rPr>
-        <w:t xml:space="preserve">3. </w:t>
-      </w:r>
-      <w:r>
-        <w:rPr>
-          <w:rFonts w:ascii="Times New Roman" w:hAnsi="Times New Roman" w:cs="Times New Roman"/>
-          <w:b/>
-          <w:sz w:val="24"/>
-          <w:szCs w:val="24"/>
-        </w:rPr>
-        <w:t>&lt;&lt;Nama Penguji Utama&gt;&gt;</w:t>
-      </w:r>
-    </w:p>
-    <w:p>
-      <w:pPr>
-        <w:spacing w:after="0" w:line="240" w:lineRule="auto"/>
-        <w:rPr>
-          <w:rFonts w:ascii="Times New Roman" w:hAnsi="Times New Roman" w:cs="Times New Roman"/>
-          <w:sz w:val="24"/>
-          <w:szCs w:val="24"/>
-        </w:rPr>
-      </w:pPr>
-      <w:r>
-        <w:rPr>
-          <w:rFonts w:ascii="Times New Roman" w:hAnsi="Times New Roman" w:cs="Times New Roman"/>
-          <w:b/>
-          <w:sz w:val="24"/>
-          <w:szCs w:val="24"/>
-        </w:rPr>
-        <w:t xml:space="preserve">4. </w:t>
-      </w:r>
-      <w:r>
-        <w:rPr>
-          <w:rFonts w:ascii="Times New Roman" w:hAnsi="Times New Roman" w:cs="Times New Roman"/>
-          <w:b/>
-          <w:sz w:val="24"/>
-          <w:szCs w:val="24"/>
-        </w:rPr>
-        <w:t>&lt;&lt;Nama Anggota Penguji&gt;&gt;</w:t>
+        <w:t>{{nama_penguji2}}</w:t>
       </w:r>
     </w:p>
     <w:p>
@@ -450,37 +621,171 @@
           <w:szCs w:val="24"/>
         </w:rPr>
       </w:pPr>
-      <w:r>
-        <w:rPr>
-          <w:rFonts w:ascii="Times New Roman" w:hAnsi="Times New Roman" w:cs="Times New Roman"/>
-          <w:sz w:val="24"/>
-          <w:szCs w:val="24"/>
-        </w:rPr>
-        <w:t xml:space="preserve">Sesuai dengan Surat Keputusan Dekan Fakultas Teknologi Informasi Nomor </w:t>
-      </w:r>
-      <w:r>
-        <w:rPr>
-          <w:rFonts w:ascii="Times New Roman" w:hAnsi="Times New Roman" w:cs="Times New Roman"/>
-          <w:sz w:val="24"/>
-          <w:szCs w:val="24"/>
-        </w:rPr>
-        <w:t>&lt;&lt;Nomor SK&gt;&gt;</w:t>
-      </w:r>
-      <w:r>
-        <w:rPr>
-          <w:rFonts w:ascii="Times New Roman" w:hAnsi="Times New Roman" w:cs="Times New Roman"/>
-          <w:sz w:val="24"/>
-          <w:szCs w:val="24"/>
-        </w:rPr>
-        <w:t xml:space="preserve"> Tanggal </w:t>
-      </w:r>
-      <w:r>
-        <w:rPr>
-          <w:rFonts w:ascii="Times New Roman" w:hAnsi="Times New Roman" w:cs="Times New Roman"/>
-          <w:sz w:val="24"/>
-          <w:szCs w:val="24"/>
-        </w:rPr>
-        <w:t>&lt;&lt;tanggal SK&gt;&gt;</w:t>
+      <w:proofErr w:type="spellStart"/>
+      <w:r>
+        <w:rPr>
+          <w:rFonts w:ascii="Times New Roman" w:hAnsi="Times New Roman" w:cs="Times New Roman"/>
+          <w:sz w:val="24"/>
+          <w:szCs w:val="24"/>
+        </w:rPr>
+        <w:t>Sesuai</w:t>
+      </w:r>
+      <w:proofErr w:type="spellEnd"/>
+      <w:r>
+        <w:rPr>
+          <w:rFonts w:ascii="Times New Roman" w:hAnsi="Times New Roman" w:cs="Times New Roman"/>
+          <w:sz w:val="24"/>
+          <w:szCs w:val="24"/>
+        </w:rPr>
+        <w:t xml:space="preserve"> </w:t>
+      </w:r>
+      <w:proofErr w:type="spellStart"/>
+      <w:r>
+        <w:rPr>
+          <w:rFonts w:ascii="Times New Roman" w:hAnsi="Times New Roman" w:cs="Times New Roman"/>
+          <w:sz w:val="24"/>
+          <w:szCs w:val="24"/>
+        </w:rPr>
+        <w:t>dengan</w:t>
+      </w:r>
+      <w:proofErr w:type="spellEnd"/>
+      <w:r>
+        <w:rPr>
+          <w:rFonts w:ascii="Times New Roman" w:hAnsi="Times New Roman" w:cs="Times New Roman"/>
+          <w:sz w:val="24"/>
+          <w:szCs w:val="24"/>
+        </w:rPr>
+        <w:t xml:space="preserve"> Surat Keputusan Dekan </w:t>
+      </w:r>
+      <w:r>
+        <w:rPr>
+          <w:rFonts w:ascii="Times New Roman" w:hAnsi="Times New Roman" w:cs="Times New Roman"/>
+          <w:sz w:val="24"/>
+          <w:szCs w:val="24"/>
+        </w:rPr>
+        <w:t>{{</w:t>
+      </w:r>
+      <w:proofErr w:type="spellStart"/>
+      <w:r>
+        <w:rPr>
+          <w:rFonts w:ascii="Times New Roman" w:hAnsi="Times New Roman" w:cs="Times New Roman"/>
+          <w:sz w:val="24"/>
+          <w:szCs w:val="24"/>
+        </w:rPr>
+        <w:t>fakultas</w:t>
+      </w:r>
+      <w:proofErr w:type="spellEnd"/>
+      <w:r>
+        <w:rPr>
+          <w:rFonts w:ascii="Times New Roman" w:hAnsi="Times New Roman" w:cs="Times New Roman"/>
+          <w:sz w:val="24"/>
+          <w:szCs w:val="24"/>
+        </w:rPr>
+        <w:t>}}</w:t>
+      </w:r>
+      <w:r>
+        <w:rPr>
+          <w:rFonts w:ascii="Times New Roman" w:hAnsi="Times New Roman" w:cs="Times New Roman"/>
+          <w:sz w:val="24"/>
+          <w:szCs w:val="24"/>
+        </w:rPr>
+        <w:t xml:space="preserve"> </w:t>
+      </w:r>
+      <w:proofErr w:type="spellStart"/>
+      <w:r>
+        <w:rPr>
+          <w:rFonts w:ascii="Times New Roman" w:hAnsi="Times New Roman" w:cs="Times New Roman"/>
+          <w:sz w:val="24"/>
+          <w:szCs w:val="24"/>
+        </w:rPr>
+        <w:t>Nomor</w:t>
+      </w:r>
+      <w:proofErr w:type="spellEnd"/>
+      <w:r>
+        <w:rPr>
+          <w:rFonts w:ascii="Times New Roman" w:hAnsi="Times New Roman" w:cs="Times New Roman"/>
+          <w:sz w:val="24"/>
+          <w:szCs w:val="24"/>
+        </w:rPr>
+        <w:t xml:space="preserve"> </w:t>
+      </w:r>
+      <w:r>
+        <w:rPr>
+          <w:rFonts w:ascii="Times New Roman" w:hAnsi="Times New Roman" w:cs="Times New Roman"/>
+          <w:sz w:val="24"/>
+          <w:szCs w:val="24"/>
+        </w:rPr>
+        <w:t>{{</w:t>
+      </w:r>
+      <w:proofErr w:type="spellStart"/>
+      <w:r>
+        <w:rPr>
+          <w:rFonts w:ascii="Times New Roman" w:hAnsi="Times New Roman" w:cs="Times New Roman"/>
+          <w:sz w:val="24"/>
+          <w:szCs w:val="24"/>
+        </w:rPr>
+        <w:t>nomor_sk</w:t>
+      </w:r>
+      <w:proofErr w:type="spellEnd"/>
+      <w:r>
+        <w:rPr>
+          <w:rFonts w:ascii="Times New Roman" w:hAnsi="Times New Roman" w:cs="Times New Roman"/>
+          <w:sz w:val="24"/>
+          <w:szCs w:val="24"/>
+        </w:rPr>
+        <w:t>}}</w:t>
+      </w:r>
+      <w:r>
+        <w:rPr>
+          <w:rFonts w:ascii="Times New Roman" w:hAnsi="Times New Roman" w:cs="Times New Roman"/>
+          <w:sz w:val="24"/>
+          <w:szCs w:val="24"/>
+        </w:rPr>
+        <w:t xml:space="preserve"> </w:t>
+      </w:r>
+      <w:proofErr w:type="spellStart"/>
+      <w:r>
+        <w:rPr>
+          <w:rFonts w:ascii="Times New Roman" w:hAnsi="Times New Roman" w:cs="Times New Roman"/>
+          <w:sz w:val="24"/>
+          <w:szCs w:val="24"/>
+        </w:rPr>
+        <w:t>Tanggal</w:t>
+      </w:r>
+      <w:proofErr w:type="spellEnd"/>
+      <w:r>
+        <w:rPr>
+          <w:rFonts w:ascii="Times New Roman" w:hAnsi="Times New Roman" w:cs="Times New Roman"/>
+          <w:sz w:val="24"/>
+          <w:szCs w:val="24"/>
+        </w:rPr>
+        <w:t xml:space="preserve"> </w:t>
+      </w:r>
+      <w:r>
+        <w:rPr>
+          <w:rFonts w:ascii="Times New Roman" w:hAnsi="Times New Roman" w:cs="Times New Roman"/>
+          <w:sz w:val="24"/>
+          <w:szCs w:val="24"/>
+        </w:rPr>
+        <w:t>{{</w:t>
+      </w:r>
+      <w:proofErr w:type="spellStart"/>
+      <w:r>
+        <w:rPr>
+          <w:rFonts w:ascii="Times New Roman" w:hAnsi="Times New Roman" w:cs="Times New Roman"/>
+          <w:sz w:val="24"/>
+          <w:szCs w:val="24"/>
+        </w:rPr>
+        <w:t>tanggal_sk</w:t>
+      </w:r>
+      <w:proofErr w:type="spellEnd"/>
+      <w:r>
+        <w:rPr>
+          <w:rFonts w:ascii="Times New Roman" w:hAnsi="Times New Roman" w:cs="Times New Roman"/>
+          <w:sz w:val="24"/>
+          <w:szCs w:val="24"/>
+        </w:rPr>
+        <w:t>}}</w:t>
       </w:r>
       <w:r>
         <w:rPr>
@@ -491,14 +796,124 @@
         </w:rPr>
         <w:t xml:space="preserve"> </w:t>
       </w:r>
-      <w:r>
-        <w:rPr>
-          <w:rFonts w:ascii="Times New Roman" w:hAnsi="Times New Roman" w:cs="Times New Roman"/>
-          <w:sz w:val="24"/>
-          <w:szCs w:val="24"/>
-        </w:rPr>
-        <w:t>maka dengan ini diberitahukan kepada bapak/ibu</w:t>
-      </w:r>
+      <w:proofErr w:type="spellStart"/>
+      <w:r>
+        <w:rPr>
+          <w:rFonts w:ascii="Times New Roman" w:hAnsi="Times New Roman" w:cs="Times New Roman"/>
+          <w:sz w:val="24"/>
+          <w:szCs w:val="24"/>
+        </w:rPr>
+        <w:t>maka</w:t>
+      </w:r>
+      <w:proofErr w:type="spellEnd"/>
+      <w:r>
+        <w:rPr>
+          <w:rFonts w:ascii="Times New Roman" w:hAnsi="Times New Roman" w:cs="Times New Roman"/>
+          <w:sz w:val="24"/>
+          <w:szCs w:val="24"/>
+        </w:rPr>
+        <w:t xml:space="preserve"> </w:t>
+      </w:r>
+      <w:proofErr w:type="spellStart"/>
+      <w:r>
+        <w:rPr>
+          <w:rFonts w:ascii="Times New Roman" w:hAnsi="Times New Roman" w:cs="Times New Roman"/>
+          <w:sz w:val="24"/>
+          <w:szCs w:val="24"/>
+        </w:rPr>
+        <w:t>dengan</w:t>
+      </w:r>
+      <w:proofErr w:type="spellEnd"/>
+      <w:r>
+        <w:rPr>
+          <w:rFonts w:ascii="Times New Roman" w:hAnsi="Times New Roman" w:cs="Times New Roman"/>
+          <w:sz w:val="24"/>
+          <w:szCs w:val="24"/>
+        </w:rPr>
+        <w:t xml:space="preserve"> </w:t>
+      </w:r>
+      <w:proofErr w:type="spellStart"/>
+      <w:r>
+        <w:rPr>
+          <w:rFonts w:ascii="Times New Roman" w:hAnsi="Times New Roman" w:cs="Times New Roman"/>
+          <w:sz w:val="24"/>
+          <w:szCs w:val="24"/>
+        </w:rPr>
+        <w:t>ini</w:t>
+      </w:r>
+      <w:proofErr w:type="spellEnd"/>
+      <w:r>
+        <w:rPr>
+          <w:rFonts w:ascii="Times New Roman" w:hAnsi="Times New Roman" w:cs="Times New Roman"/>
+          <w:sz w:val="24"/>
+          <w:szCs w:val="24"/>
+        </w:rPr>
+        <w:t xml:space="preserve"> </w:t>
+      </w:r>
+      <w:proofErr w:type="spellStart"/>
+      <w:r>
+        <w:rPr>
+          <w:rFonts w:ascii="Times New Roman" w:hAnsi="Times New Roman" w:cs="Times New Roman"/>
+          <w:sz w:val="24"/>
+          <w:szCs w:val="24"/>
+        </w:rPr>
+        <w:t>diberitahukan</w:t>
+      </w:r>
+      <w:proofErr w:type="spellEnd"/>
+      <w:r>
+        <w:rPr>
+          <w:rFonts w:ascii="Times New Roman" w:hAnsi="Times New Roman" w:cs="Times New Roman"/>
+          <w:sz w:val="24"/>
+          <w:szCs w:val="24"/>
+        </w:rPr>
+        <w:t xml:space="preserve"> </w:t>
+      </w:r>
+      <w:proofErr w:type="spellStart"/>
+      <w:r>
+        <w:rPr>
+          <w:rFonts w:ascii="Times New Roman" w:hAnsi="Times New Roman" w:cs="Times New Roman"/>
+          <w:sz w:val="24"/>
+          <w:szCs w:val="24"/>
+        </w:rPr>
+        <w:t>kepada</w:t>
+      </w:r>
+      <w:proofErr w:type="spellEnd"/>
+      <w:r>
+        <w:rPr>
+          <w:rFonts w:ascii="Times New Roman" w:hAnsi="Times New Roman" w:cs="Times New Roman"/>
+          <w:sz w:val="24"/>
+          <w:szCs w:val="24"/>
+        </w:rPr>
+        <w:t xml:space="preserve"> </w:t>
+      </w:r>
+      <w:proofErr w:type="spellStart"/>
+      <w:r>
+        <w:rPr>
+          <w:rFonts w:ascii="Times New Roman" w:hAnsi="Times New Roman" w:cs="Times New Roman"/>
+          <w:sz w:val="24"/>
+          <w:szCs w:val="24"/>
+        </w:rPr>
+        <w:t>bapak</w:t>
+      </w:r>
+      <w:proofErr w:type="spellEnd"/>
+      <w:r>
+        <w:rPr>
+          <w:rFonts w:ascii="Times New Roman" w:hAnsi="Times New Roman" w:cs="Times New Roman"/>
+          <w:sz w:val="24"/>
+          <w:szCs w:val="24"/>
+        </w:rPr>
+        <w:t>/</w:t>
+      </w:r>
+      <w:proofErr w:type="spellStart"/>
+      <w:r>
+        <w:rPr>
+          <w:rFonts w:ascii="Times New Roman" w:hAnsi="Times New Roman" w:cs="Times New Roman"/>
+          <w:sz w:val="24"/>
+          <w:szCs w:val="24"/>
+        </w:rPr>
+        <w:t>ibu</w:t>
+      </w:r>
+      <w:proofErr w:type="spellEnd"/>
       <w:r>
         <w:rPr>
           <w:rFonts w:ascii="Times New Roman" w:hAnsi="Times New Roman" w:cs="Times New Roman"/>
@@ -508,14 +923,116 @@
         </w:rPr>
         <w:t xml:space="preserve"> </w:t>
       </w:r>
-      <w:r>
-        <w:rPr>
-          <w:rFonts w:ascii="Times New Roman" w:hAnsi="Times New Roman" w:cs="Times New Roman"/>
-          <w:sz w:val="24"/>
-          <w:szCs w:val="24"/>
-        </w:rPr>
-        <w:t>bahwa pelaksanaan ujian skripsi sarjana atas :</w:t>
-      </w:r>
+      <w:proofErr w:type="spellStart"/>
+      <w:r>
+        <w:rPr>
+          <w:rFonts w:ascii="Times New Roman" w:hAnsi="Times New Roman" w:cs="Times New Roman"/>
+          <w:sz w:val="24"/>
+          <w:szCs w:val="24"/>
+        </w:rPr>
+        <w:t>bahwa</w:t>
+      </w:r>
+      <w:proofErr w:type="spellEnd"/>
+      <w:r>
+        <w:rPr>
+          <w:rFonts w:ascii="Times New Roman" w:hAnsi="Times New Roman" w:cs="Times New Roman"/>
+          <w:sz w:val="24"/>
+          <w:szCs w:val="24"/>
+        </w:rPr>
+        <w:t xml:space="preserve"> </w:t>
+      </w:r>
+      <w:proofErr w:type="spellStart"/>
+      <w:r>
+        <w:rPr>
+          <w:rFonts w:ascii="Times New Roman" w:hAnsi="Times New Roman" w:cs="Times New Roman"/>
+          <w:sz w:val="24"/>
+          <w:szCs w:val="24"/>
+        </w:rPr>
+        <w:t>pelaksanaan</w:t>
+      </w:r>
+      <w:proofErr w:type="spellEnd"/>
+      <w:r>
+        <w:rPr>
+          <w:rFonts w:ascii="Times New Roman" w:hAnsi="Times New Roman" w:cs="Times New Roman"/>
+          <w:sz w:val="24"/>
+          <w:szCs w:val="24"/>
+        </w:rPr>
+        <w:t xml:space="preserve"> </w:t>
+      </w:r>
+      <w:proofErr w:type="spellStart"/>
+      <w:r>
+        <w:rPr>
+          <w:rFonts w:ascii="Times New Roman" w:hAnsi="Times New Roman" w:cs="Times New Roman"/>
+          <w:sz w:val="24"/>
+          <w:szCs w:val="24"/>
+        </w:rPr>
+        <w:t>ujian</w:t>
+      </w:r>
+      <w:proofErr w:type="spellEnd"/>
+      <w:r>
+        <w:rPr>
+          <w:rFonts w:ascii="Times New Roman" w:hAnsi="Times New Roman" w:cs="Times New Roman"/>
+          <w:sz w:val="24"/>
+          <w:szCs w:val="24"/>
+        </w:rPr>
+        <w:t xml:space="preserve"> </w:t>
+      </w:r>
+      <w:proofErr w:type="spellStart"/>
+      <w:r>
+        <w:rPr>
+          <w:rFonts w:ascii="Times New Roman" w:hAnsi="Times New Roman" w:cs="Times New Roman"/>
+          <w:sz w:val="24"/>
+          <w:szCs w:val="24"/>
+        </w:rPr>
+        <w:t>skripsi</w:t>
+      </w:r>
+      <w:proofErr w:type="spellEnd"/>
+      <w:r>
+        <w:rPr>
+          <w:rFonts w:ascii="Times New Roman" w:hAnsi="Times New Roman" w:cs="Times New Roman"/>
+          <w:sz w:val="24"/>
+          <w:szCs w:val="24"/>
+        </w:rPr>
+        <w:t xml:space="preserve"> </w:t>
+      </w:r>
+      <w:proofErr w:type="spellStart"/>
+      <w:r>
+        <w:rPr>
+          <w:rFonts w:ascii="Times New Roman" w:hAnsi="Times New Roman" w:cs="Times New Roman"/>
+          <w:sz w:val="24"/>
+          <w:szCs w:val="24"/>
+        </w:rPr>
+        <w:t>sarjana</w:t>
+      </w:r>
+      <w:proofErr w:type="spellEnd"/>
+      <w:r>
+        <w:rPr>
+          <w:rFonts w:ascii="Times New Roman" w:hAnsi="Times New Roman" w:cs="Times New Roman"/>
+          <w:sz w:val="24"/>
+          <w:szCs w:val="24"/>
+        </w:rPr>
+        <w:t xml:space="preserve"> </w:t>
+      </w:r>
+      <w:proofErr w:type="spellStart"/>
+      <w:proofErr w:type="gramStart"/>
+      <w:r>
+        <w:rPr>
+          <w:rFonts w:ascii="Times New Roman" w:hAnsi="Times New Roman" w:cs="Times New Roman"/>
+          <w:sz w:val="24"/>
+          <w:szCs w:val="24"/>
+        </w:rPr>
+        <w:t>atas</w:t>
+      </w:r>
+      <w:proofErr w:type="spellEnd"/>
+      <w:r>
+        <w:rPr>
+          <w:rFonts w:ascii="Times New Roman" w:hAnsi="Times New Roman" w:cs="Times New Roman"/>
+          <w:sz w:val="24"/>
+          <w:szCs w:val="24"/>
+        </w:rPr>
+        <w:t xml:space="preserve"> :</w:t>
+      </w:r>
+      <w:proofErr w:type="gramEnd"/>
     </w:p>
     <w:p>
       <w:pPr>
@@ -560,6 +1077,32 @@
         <w:tab/>
         <w:t xml:space="preserve">: </w:t>
       </w:r>
+      <w:r>
+        <w:rPr>
+          <w:rFonts w:ascii="Times New Roman" w:hAnsi="Times New Roman" w:cs="Times New Roman"/>
+          <w:sz w:val="24"/>
+          <w:szCs w:val="24"/>
+        </w:rPr>
+        <w:t>{{</w:t>
+      </w:r>
+      <w:proofErr w:type="spellStart"/>
+      <w:r>
+        <w:rPr>
+          <w:rFonts w:ascii="Times New Roman" w:hAnsi="Times New Roman" w:cs="Times New Roman"/>
+          <w:sz w:val="24"/>
+          <w:szCs w:val="24"/>
+        </w:rPr>
+        <w:t>nama_mahasiswa</w:t>
+      </w:r>
+      <w:proofErr w:type="spellEnd"/>
+      <w:r>
+        <w:rPr>
+          <w:rFonts w:ascii="Times New Roman" w:hAnsi="Times New Roman" w:cs="Times New Roman"/>
+          <w:sz w:val="24"/>
+          <w:szCs w:val="24"/>
+        </w:rPr>
+        <w:t>}}</w:t>
+      </w:r>
     </w:p>
     <w:p>
       <w:pPr>
@@ -603,6 +1146,32 @@
         <w:tab/>
         <w:t xml:space="preserve">: </w:t>
       </w:r>
+      <w:r>
+        <w:rPr>
+          <w:rFonts w:ascii="Times New Roman" w:hAnsi="Times New Roman" w:cs="Times New Roman"/>
+          <w:sz w:val="24"/>
+          <w:szCs w:val="24"/>
+        </w:rPr>
+        <w:t>{{</w:t>
+      </w:r>
+      <w:proofErr w:type="spellStart"/>
+      <w:r>
+        <w:rPr>
+          <w:rFonts w:ascii="Times New Roman" w:hAnsi="Times New Roman" w:cs="Times New Roman"/>
+          <w:sz w:val="24"/>
+          <w:szCs w:val="24"/>
+        </w:rPr>
+        <w:t>npm</w:t>
+      </w:r>
+      <w:proofErr w:type="spellEnd"/>
+      <w:r>
+        <w:rPr>
+          <w:rFonts w:ascii="Times New Roman" w:hAnsi="Times New Roman" w:cs="Times New Roman"/>
+          <w:sz w:val="24"/>
+          <w:szCs w:val="24"/>
+        </w:rPr>
+        <w:t>}}</w:t>
+      </w:r>
     </w:p>
     <w:p>
       <w:pPr>
@@ -649,6 +1218,35 @@
         </w:rPr>
         <w:t xml:space="preserve"> </w:t>
       </w:r>
+      <w:r>
+        <w:rPr>
+          <w:rFonts w:ascii="Times New Roman" w:hAnsi="Times New Roman" w:cs="Times New Roman"/>
+          <w:bCs/>
+          <w:sz w:val="24"/>
+          <w:szCs w:val="24"/>
+        </w:rPr>
+        <w:t>{{</w:t>
+      </w:r>
+      <w:proofErr w:type="spellStart"/>
+      <w:r>
+        <w:rPr>
+          <w:rFonts w:ascii="Times New Roman" w:hAnsi="Times New Roman" w:cs="Times New Roman"/>
+          <w:bCs/>
+          <w:sz w:val="24"/>
+          <w:szCs w:val="24"/>
+        </w:rPr>
+        <w:t>prodi</w:t>
+      </w:r>
+      <w:proofErr w:type="spellEnd"/>
+      <w:r>
+        <w:rPr>
+          <w:rFonts w:ascii="Times New Roman" w:hAnsi="Times New Roman" w:cs="Times New Roman"/>
+          <w:bCs/>
+          <w:sz w:val="24"/>
+          <w:szCs w:val="24"/>
+        </w:rPr>
+        <w:t>}}</w:t>
+      </w:r>
     </w:p>
     <w:p>
       <w:pPr>
@@ -660,13 +1258,67 @@
           <w:szCs w:val="24"/>
         </w:rPr>
       </w:pPr>
-      <w:r>
-        <w:rPr>
-          <w:rFonts w:ascii="Times New Roman" w:hAnsi="Times New Roman" w:cs="Times New Roman"/>
-          <w:sz w:val="24"/>
-          <w:szCs w:val="24"/>
-        </w:rPr>
-        <w:t xml:space="preserve">Judul Skripsi               : </w:t>
+      <w:proofErr w:type="spellStart"/>
+      <w:r>
+        <w:rPr>
+          <w:rFonts w:ascii="Times New Roman" w:hAnsi="Times New Roman" w:cs="Times New Roman"/>
+          <w:sz w:val="24"/>
+          <w:szCs w:val="24"/>
+        </w:rPr>
+        <w:t>Judul</w:t>
+      </w:r>
+      <w:proofErr w:type="spellEnd"/>
+      <w:r>
+        <w:rPr>
+          <w:rFonts w:ascii="Times New Roman" w:hAnsi="Times New Roman" w:cs="Times New Roman"/>
+          <w:sz w:val="24"/>
+          <w:szCs w:val="24"/>
+        </w:rPr>
+        <w:t xml:space="preserve"> Skripsi             </w:t>
+      </w:r>
+      <w:proofErr w:type="gramStart"/>
+      <w:r>
+        <w:rPr>
+          <w:rFonts w:ascii="Times New Roman" w:hAnsi="Times New Roman" w:cs="Times New Roman"/>
+          <w:sz w:val="24"/>
+          <w:szCs w:val="24"/>
+        </w:rPr>
+        <w:t xml:space="preserve">  :</w:t>
+      </w:r>
+      <w:proofErr w:type="gramEnd"/>
+      <w:r>
+        <w:rPr>
+          <w:rFonts w:ascii="Times New Roman" w:hAnsi="Times New Roman" w:cs="Times New Roman"/>
+          <w:sz w:val="24"/>
+          <w:szCs w:val="24"/>
+        </w:rPr>
+        <w:t xml:space="preserve"> </w:t>
+      </w:r>
+      <w:r>
+        <w:rPr>
+          <w:rFonts w:ascii="Times New Roman" w:hAnsi="Times New Roman" w:cs="Times New Roman"/>
+          <w:sz w:val="24"/>
+          <w:szCs w:val="24"/>
+        </w:rPr>
+        <w:t>{{</w:t>
+      </w:r>
+      <w:proofErr w:type="spellStart"/>
+      <w:r>
+        <w:rPr>
+          <w:rFonts w:ascii="Times New Roman" w:hAnsi="Times New Roman" w:cs="Times New Roman"/>
+          <w:sz w:val="24"/>
+          <w:szCs w:val="24"/>
+        </w:rPr>
+        <w:t>judul_skripsi</w:t>
+      </w:r>
+      <w:proofErr w:type="spellEnd"/>
+      <w:r>
+        <w:rPr>
+          <w:rFonts w:ascii="Times New Roman" w:hAnsi="Times New Roman" w:cs="Times New Roman"/>
+          <w:sz w:val="24"/>
+          <w:szCs w:val="24"/>
+        </w:rPr>
+        <w:t>}}</w:t>
       </w:r>
     </w:p>
     <w:p>
@@ -690,8 +1342,54 @@
           <w:sz w:val="24"/>
           <w:szCs w:val="24"/>
         </w:rPr>
-        <w:t>Yang akan dilaksanakan pada :</w:t>
-      </w:r>
+        <w:t xml:space="preserve">Yang </w:t>
+      </w:r>
+      <w:proofErr w:type="spellStart"/>
+      <w:r>
+        <w:rPr>
+          <w:rFonts w:ascii="Times New Roman" w:hAnsi="Times New Roman" w:cs="Times New Roman"/>
+          <w:sz w:val="24"/>
+          <w:szCs w:val="24"/>
+        </w:rPr>
+        <w:t>akan</w:t>
+      </w:r>
+      <w:proofErr w:type="spellEnd"/>
+      <w:r>
+        <w:rPr>
+          <w:rFonts w:ascii="Times New Roman" w:hAnsi="Times New Roman" w:cs="Times New Roman"/>
+          <w:sz w:val="24"/>
+          <w:szCs w:val="24"/>
+        </w:rPr>
+        <w:t xml:space="preserve"> </w:t>
+      </w:r>
+      <w:proofErr w:type="spellStart"/>
+      <w:r>
+        <w:rPr>
+          <w:rFonts w:ascii="Times New Roman" w:hAnsi="Times New Roman" w:cs="Times New Roman"/>
+          <w:sz w:val="24"/>
+          <w:szCs w:val="24"/>
+        </w:rPr>
+        <w:t>dilaksanakan</w:t>
+      </w:r>
+      <w:proofErr w:type="spellEnd"/>
+      <w:r>
+        <w:rPr>
+          <w:rFonts w:ascii="Times New Roman" w:hAnsi="Times New Roman" w:cs="Times New Roman"/>
+          <w:sz w:val="24"/>
+          <w:szCs w:val="24"/>
+        </w:rPr>
+        <w:t xml:space="preserve"> </w:t>
+      </w:r>
+      <w:proofErr w:type="gramStart"/>
+      <w:r>
+        <w:rPr>
+          <w:rFonts w:ascii="Times New Roman" w:hAnsi="Times New Roman" w:cs="Times New Roman"/>
+          <w:sz w:val="24"/>
+          <w:szCs w:val="24"/>
+        </w:rPr>
+        <w:t>pada :</w:t>
+      </w:r>
+      <w:proofErr w:type="gramEnd"/>
     </w:p>
     <w:p>
       <w:pPr>
@@ -702,6 +1400,8 @@
           <w:szCs w:val="24"/>
         </w:rPr>
       </w:pPr>
+      <w:proofErr w:type="spellStart"/>
+      <w:proofErr w:type="gramStart"/>
       <w:r>
         <w:rPr>
           <w:rFonts w:ascii="Times New Roman" w:hAnsi="Times New Roman" w:cs="Times New Roman"/>
@@ -710,6 +1410,8 @@
         </w:rPr>
         <w:t>Hari,Tanggal</w:t>
       </w:r>
+      <w:proofErr w:type="spellEnd"/>
+      <w:proofErr w:type="gramEnd"/>
       <w:r>
         <w:rPr>
           <w:rFonts w:ascii="Times New Roman" w:hAnsi="Times New Roman" w:cs="Times New Roman"/>
@@ -736,6 +1438,44 @@
         </w:rPr>
         <w:t xml:space="preserve"> </w:t>
       </w:r>
+      <w:r>
+        <w:rPr>
+          <w:rFonts w:ascii="Times New Roman" w:hAnsi="Times New Roman" w:cs="Times New Roman"/>
+          <w:bCs/>
+          <w:sz w:val="24"/>
+          <w:szCs w:val="24"/>
+        </w:rPr>
+        <w:t>{{</w:t>
+      </w:r>
+      <w:proofErr w:type="spellStart"/>
+      <w:r>
+        <w:rPr>
+          <w:rFonts w:ascii="Times New Roman" w:hAnsi="Times New Roman" w:cs="Times New Roman"/>
+          <w:bCs/>
+          <w:sz w:val="24"/>
+          <w:szCs w:val="24"/>
+        </w:rPr>
+        <w:t>sidang_</w:t>
+      </w:r>
+      <w:r>
+        <w:rPr>
+          <w:rFonts w:ascii="Times New Roman" w:hAnsi="Times New Roman" w:cs="Times New Roman"/>
+          <w:bCs/>
+          <w:sz w:val="24"/>
+          <w:szCs w:val="24"/>
+        </w:rPr>
+        <w:t>date</w:t>
+      </w:r>
+      <w:proofErr w:type="spellEnd"/>
+      <w:r>
+        <w:rPr>
+          <w:rFonts w:ascii="Times New Roman" w:hAnsi="Times New Roman" w:cs="Times New Roman"/>
+          <w:bCs/>
+          <w:sz w:val="24"/>
+          <w:szCs w:val="24"/>
+        </w:rPr>
+        <w:t>}}</w:t>
+      </w:r>
     </w:p>
     <w:p>
       <w:pPr>
@@ -771,6 +1511,32 @@
         </w:rPr>
         <w:tab/>
         <w:t xml:space="preserve">: </w:t>
+      </w:r>
+      <w:r>
+        <w:rPr>
+          <w:rFonts w:ascii="Times New Roman" w:hAnsi="Times New Roman" w:cs="Times New Roman"/>
+          <w:sz w:val="24"/>
+          <w:szCs w:val="24"/>
+        </w:rPr>
+        <w:t>{{</w:t>
+      </w:r>
+      <w:proofErr w:type="spellStart"/>
+      <w:r>
+        <w:rPr>
+          <w:rFonts w:ascii="Times New Roman" w:hAnsi="Times New Roman" w:cs="Times New Roman"/>
+          <w:sz w:val="24"/>
+          <w:szCs w:val="24"/>
+        </w:rPr>
+        <w:t>sidang_time</w:t>
+      </w:r>
+      <w:proofErr w:type="spellEnd"/>
+      <w:r>
+        <w:rPr>
+          <w:rFonts w:ascii="Times New Roman" w:hAnsi="Times New Roman" w:cs="Times New Roman"/>
+          <w:sz w:val="24"/>
+          <w:szCs w:val="24"/>
+        </w:rPr>
+        <w:t>}}</w:t>
       </w:r>
     </w:p>
     <w:p>
@@ -824,6 +1590,32 @@
         <w:tab/>
         <w:t xml:space="preserve">: </w:t>
       </w:r>
+      <w:r>
+        <w:rPr>
+          <w:rFonts w:ascii="Times New Roman" w:hAnsi="Times New Roman" w:cs="Times New Roman"/>
+          <w:sz w:val="24"/>
+          <w:szCs w:val="24"/>
+        </w:rPr>
+        <w:t>{{</w:t>
+      </w:r>
+      <w:proofErr w:type="spellStart"/>
+      <w:r>
+        <w:rPr>
+          <w:rFonts w:ascii="Times New Roman" w:hAnsi="Times New Roman" w:cs="Times New Roman"/>
+          <w:sz w:val="24"/>
+          <w:szCs w:val="24"/>
+        </w:rPr>
+        <w:t>tempat_sidang</w:t>
+      </w:r>
+      <w:proofErr w:type="spellEnd"/>
+      <w:r>
+        <w:rPr>
+          <w:rFonts w:ascii="Times New Roman" w:hAnsi="Times New Roman" w:cs="Times New Roman"/>
+          <w:sz w:val="24"/>
+          <w:szCs w:val="24"/>
+        </w:rPr>
+        <w:t>}}</w:t>
+      </w:r>
     </w:p>
     <w:p>
       <w:pPr>
@@ -838,14 +1630,214 @@
           <w:szCs w:val="24"/>
         </w:rPr>
       </w:pPr>
-      <w:r>
-        <w:rPr>
-          <w:rFonts w:ascii="Times New Roman" w:hAnsi="Times New Roman" w:cs="Times New Roman"/>
-          <w:sz w:val="24"/>
-          <w:szCs w:val="24"/>
-        </w:rPr>
-        <w:t>Berhubung padatnya jadwal mahasiswa yang akan menempuh ujian skripsi, maka dimohon bapak/ibu</w:t>
-      </w:r>
+      <w:proofErr w:type="spellStart"/>
+      <w:r>
+        <w:rPr>
+          <w:rFonts w:ascii="Times New Roman" w:hAnsi="Times New Roman" w:cs="Times New Roman"/>
+          <w:sz w:val="24"/>
+          <w:szCs w:val="24"/>
+        </w:rPr>
+        <w:t>Berhubung</w:t>
+      </w:r>
+      <w:proofErr w:type="spellEnd"/>
+      <w:r>
+        <w:rPr>
+          <w:rFonts w:ascii="Times New Roman" w:hAnsi="Times New Roman" w:cs="Times New Roman"/>
+          <w:sz w:val="24"/>
+          <w:szCs w:val="24"/>
+        </w:rPr>
+        <w:t xml:space="preserve"> </w:t>
+      </w:r>
+      <w:proofErr w:type="spellStart"/>
+      <w:r>
+        <w:rPr>
+          <w:rFonts w:ascii="Times New Roman" w:hAnsi="Times New Roman" w:cs="Times New Roman"/>
+          <w:sz w:val="24"/>
+          <w:szCs w:val="24"/>
+        </w:rPr>
+        <w:t>padatnya</w:t>
+      </w:r>
+      <w:proofErr w:type="spellEnd"/>
+      <w:r>
+        <w:rPr>
+          <w:rFonts w:ascii="Times New Roman" w:hAnsi="Times New Roman" w:cs="Times New Roman"/>
+          <w:sz w:val="24"/>
+          <w:szCs w:val="24"/>
+        </w:rPr>
+        <w:t xml:space="preserve"> </w:t>
+      </w:r>
+      <w:proofErr w:type="spellStart"/>
+      <w:r>
+        <w:rPr>
+          <w:rFonts w:ascii="Times New Roman" w:hAnsi="Times New Roman" w:cs="Times New Roman"/>
+          <w:sz w:val="24"/>
+          <w:szCs w:val="24"/>
+        </w:rPr>
+        <w:t>jadwal</w:t>
+      </w:r>
+      <w:proofErr w:type="spellEnd"/>
+      <w:r>
+        <w:rPr>
+          <w:rFonts w:ascii="Times New Roman" w:hAnsi="Times New Roman" w:cs="Times New Roman"/>
+          <w:sz w:val="24"/>
+          <w:szCs w:val="24"/>
+        </w:rPr>
+        <w:t xml:space="preserve"> </w:t>
+      </w:r>
+      <w:proofErr w:type="spellStart"/>
+      <w:r>
+        <w:rPr>
+          <w:rFonts w:ascii="Times New Roman" w:hAnsi="Times New Roman" w:cs="Times New Roman"/>
+          <w:sz w:val="24"/>
+          <w:szCs w:val="24"/>
+        </w:rPr>
+        <w:t>mahasiswa</w:t>
+      </w:r>
+      <w:proofErr w:type="spellEnd"/>
+      <w:r>
+        <w:rPr>
+          <w:rFonts w:ascii="Times New Roman" w:hAnsi="Times New Roman" w:cs="Times New Roman"/>
+          <w:sz w:val="24"/>
+          <w:szCs w:val="24"/>
+        </w:rPr>
+        <w:t xml:space="preserve"> yang </w:t>
+      </w:r>
+      <w:proofErr w:type="spellStart"/>
+      <w:r>
+        <w:rPr>
+          <w:rFonts w:ascii="Times New Roman" w:hAnsi="Times New Roman" w:cs="Times New Roman"/>
+          <w:sz w:val="24"/>
+          <w:szCs w:val="24"/>
+        </w:rPr>
+        <w:t>akan</w:t>
+      </w:r>
+      <w:proofErr w:type="spellEnd"/>
+      <w:r>
+        <w:rPr>
+          <w:rFonts w:ascii="Times New Roman" w:hAnsi="Times New Roman" w:cs="Times New Roman"/>
+          <w:sz w:val="24"/>
+          <w:szCs w:val="24"/>
+        </w:rPr>
+        <w:t xml:space="preserve"> </w:t>
+      </w:r>
+      <w:proofErr w:type="spellStart"/>
+      <w:r>
+        <w:rPr>
+          <w:rFonts w:ascii="Times New Roman" w:hAnsi="Times New Roman" w:cs="Times New Roman"/>
+          <w:sz w:val="24"/>
+          <w:szCs w:val="24"/>
+        </w:rPr>
+        <w:t>menempuh</w:t>
+      </w:r>
+      <w:proofErr w:type="spellEnd"/>
+      <w:r>
+        <w:rPr>
+          <w:rFonts w:ascii="Times New Roman" w:hAnsi="Times New Roman" w:cs="Times New Roman"/>
+          <w:sz w:val="24"/>
+          <w:szCs w:val="24"/>
+        </w:rPr>
+        <w:t xml:space="preserve"> </w:t>
+      </w:r>
+      <w:proofErr w:type="spellStart"/>
+      <w:r>
+        <w:rPr>
+          <w:rFonts w:ascii="Times New Roman" w:hAnsi="Times New Roman" w:cs="Times New Roman"/>
+          <w:sz w:val="24"/>
+          <w:szCs w:val="24"/>
+        </w:rPr>
+        <w:t>ujian</w:t>
+      </w:r>
+      <w:proofErr w:type="spellEnd"/>
+      <w:r>
+        <w:rPr>
+          <w:rFonts w:ascii="Times New Roman" w:hAnsi="Times New Roman" w:cs="Times New Roman"/>
+          <w:sz w:val="24"/>
+          <w:szCs w:val="24"/>
+        </w:rPr>
+        <w:t xml:space="preserve"> </w:t>
+      </w:r>
+      <w:proofErr w:type="spellStart"/>
+      <w:r>
+        <w:rPr>
+          <w:rFonts w:ascii="Times New Roman" w:hAnsi="Times New Roman" w:cs="Times New Roman"/>
+          <w:sz w:val="24"/>
+          <w:szCs w:val="24"/>
+        </w:rPr>
+        <w:t>skripsi</w:t>
+      </w:r>
+      <w:proofErr w:type="spellEnd"/>
+      <w:r>
+        <w:rPr>
+          <w:rFonts w:ascii="Times New Roman" w:hAnsi="Times New Roman" w:cs="Times New Roman"/>
+          <w:sz w:val="24"/>
+          <w:szCs w:val="24"/>
+        </w:rPr>
+        <w:t xml:space="preserve">, </w:t>
+      </w:r>
+      <w:proofErr w:type="spellStart"/>
+      <w:r>
+        <w:rPr>
+          <w:rFonts w:ascii="Times New Roman" w:hAnsi="Times New Roman" w:cs="Times New Roman"/>
+          <w:sz w:val="24"/>
+          <w:szCs w:val="24"/>
+        </w:rPr>
+        <w:t>maka</w:t>
+      </w:r>
+      <w:proofErr w:type="spellEnd"/>
+      <w:r>
+        <w:rPr>
+          <w:rFonts w:ascii="Times New Roman" w:hAnsi="Times New Roman" w:cs="Times New Roman"/>
+          <w:sz w:val="24"/>
+          <w:szCs w:val="24"/>
+        </w:rPr>
+        <w:t xml:space="preserve"> </w:t>
+      </w:r>
+      <w:proofErr w:type="spellStart"/>
+      <w:r>
+        <w:rPr>
+          <w:rFonts w:ascii="Times New Roman" w:hAnsi="Times New Roman" w:cs="Times New Roman"/>
+          <w:sz w:val="24"/>
+          <w:szCs w:val="24"/>
+        </w:rPr>
+        <w:t>dimohon</w:t>
+      </w:r>
+      <w:proofErr w:type="spellEnd"/>
+      <w:r>
+        <w:rPr>
+          <w:rFonts w:ascii="Times New Roman" w:hAnsi="Times New Roman" w:cs="Times New Roman"/>
+          <w:sz w:val="24"/>
+          <w:szCs w:val="24"/>
+        </w:rPr>
+        <w:t xml:space="preserve"> </w:t>
+      </w:r>
+      <w:proofErr w:type="spellStart"/>
+      <w:r>
+        <w:rPr>
+          <w:rFonts w:ascii="Times New Roman" w:hAnsi="Times New Roman" w:cs="Times New Roman"/>
+          <w:sz w:val="24"/>
+          <w:szCs w:val="24"/>
+        </w:rPr>
+        <w:t>bapak</w:t>
+      </w:r>
+      <w:proofErr w:type="spellEnd"/>
+      <w:r>
+        <w:rPr>
+          <w:rFonts w:ascii="Times New Roman" w:hAnsi="Times New Roman" w:cs="Times New Roman"/>
+          <w:sz w:val="24"/>
+          <w:szCs w:val="24"/>
+        </w:rPr>
+        <w:t>/</w:t>
+      </w:r>
+      <w:proofErr w:type="spellStart"/>
+      <w:r>
+        <w:rPr>
+          <w:rFonts w:ascii="Times New Roman" w:hAnsi="Times New Roman" w:cs="Times New Roman"/>
+          <w:sz w:val="24"/>
+          <w:szCs w:val="24"/>
+        </w:rPr>
+        <w:t>ibu</w:t>
+      </w:r>
+      <w:proofErr w:type="spellEnd"/>
       <w:r>
         <w:rPr>
           <w:rFonts w:ascii="Times New Roman" w:hAnsi="Times New Roman" w:cs="Times New Roman"/>
@@ -855,13 +1847,59 @@
         </w:rPr>
         <w:t xml:space="preserve"> </w:t>
       </w:r>
-      <w:r>
-        <w:rPr>
-          <w:rFonts w:ascii="Times New Roman" w:hAnsi="Times New Roman" w:cs="Times New Roman"/>
-          <w:sz w:val="24"/>
-          <w:szCs w:val="24"/>
-        </w:rPr>
-        <w:t>hadir tepat pada waktunya.</w:t>
+      <w:proofErr w:type="spellStart"/>
+      <w:r>
+        <w:rPr>
+          <w:rFonts w:ascii="Times New Roman" w:hAnsi="Times New Roman" w:cs="Times New Roman"/>
+          <w:sz w:val="24"/>
+          <w:szCs w:val="24"/>
+        </w:rPr>
+        <w:t>hadir</w:t>
+      </w:r>
+      <w:proofErr w:type="spellEnd"/>
+      <w:r>
+        <w:rPr>
+          <w:rFonts w:ascii="Times New Roman" w:hAnsi="Times New Roman" w:cs="Times New Roman"/>
+          <w:sz w:val="24"/>
+          <w:szCs w:val="24"/>
+        </w:rPr>
+        <w:t xml:space="preserve"> </w:t>
+      </w:r>
+      <w:proofErr w:type="spellStart"/>
+      <w:r>
+        <w:rPr>
+          <w:rFonts w:ascii="Times New Roman" w:hAnsi="Times New Roman" w:cs="Times New Roman"/>
+          <w:sz w:val="24"/>
+          <w:szCs w:val="24"/>
+        </w:rPr>
+        <w:t>tepat</w:t>
+      </w:r>
+      <w:proofErr w:type="spellEnd"/>
+      <w:r>
+        <w:rPr>
+          <w:rFonts w:ascii="Times New Roman" w:hAnsi="Times New Roman" w:cs="Times New Roman"/>
+          <w:sz w:val="24"/>
+          <w:szCs w:val="24"/>
+        </w:rPr>
+        <w:t xml:space="preserve"> pada </w:t>
+      </w:r>
+      <w:proofErr w:type="spellStart"/>
+      <w:r>
+        <w:rPr>
+          <w:rFonts w:ascii="Times New Roman" w:hAnsi="Times New Roman" w:cs="Times New Roman"/>
+          <w:sz w:val="24"/>
+          <w:szCs w:val="24"/>
+        </w:rPr>
+        <w:t>waktunya</w:t>
+      </w:r>
+      <w:proofErr w:type="spellEnd"/>
+      <w:r>
+        <w:rPr>
+          <w:rFonts w:ascii="Times New Roman" w:hAnsi="Times New Roman" w:cs="Times New Roman"/>
+          <w:sz w:val="24"/>
+          <w:szCs w:val="24"/>
+        </w:rPr>
+        <w:t>.</w:t>
       </w:r>
     </w:p>
     <w:p>
@@ -877,13 +1915,77 @@
           <w:szCs w:val="24"/>
         </w:rPr>
       </w:pPr>
-      <w:r>
-        <w:rPr>
-          <w:rFonts w:ascii="Times New Roman" w:hAnsi="Times New Roman" w:cs="Times New Roman"/>
-          <w:sz w:val="24"/>
-          <w:szCs w:val="24"/>
-        </w:rPr>
-        <w:t xml:space="preserve">Demikian kami sampaikan. Atas perhatian dan kesediaan </w:t>
+      <w:proofErr w:type="spellStart"/>
+      <w:r>
+        <w:rPr>
+          <w:rFonts w:ascii="Times New Roman" w:hAnsi="Times New Roman" w:cs="Times New Roman"/>
+          <w:sz w:val="24"/>
+          <w:szCs w:val="24"/>
+        </w:rPr>
+        <w:t>Demikian</w:t>
+      </w:r>
+      <w:proofErr w:type="spellEnd"/>
+      <w:r>
+        <w:rPr>
+          <w:rFonts w:ascii="Times New Roman" w:hAnsi="Times New Roman" w:cs="Times New Roman"/>
+          <w:sz w:val="24"/>
+          <w:szCs w:val="24"/>
+        </w:rPr>
+        <w:t xml:space="preserve"> kami </w:t>
+      </w:r>
+      <w:proofErr w:type="spellStart"/>
+      <w:r>
+        <w:rPr>
+          <w:rFonts w:ascii="Times New Roman" w:hAnsi="Times New Roman" w:cs="Times New Roman"/>
+          <w:sz w:val="24"/>
+          <w:szCs w:val="24"/>
+        </w:rPr>
+        <w:t>sampaikan</w:t>
+      </w:r>
+      <w:proofErr w:type="spellEnd"/>
+      <w:r>
+        <w:rPr>
+          <w:rFonts w:ascii="Times New Roman" w:hAnsi="Times New Roman" w:cs="Times New Roman"/>
+          <w:sz w:val="24"/>
+          <w:szCs w:val="24"/>
+        </w:rPr>
+        <w:t xml:space="preserve">. Atas </w:t>
+      </w:r>
+      <w:proofErr w:type="spellStart"/>
+      <w:r>
+        <w:rPr>
+          <w:rFonts w:ascii="Times New Roman" w:hAnsi="Times New Roman" w:cs="Times New Roman"/>
+          <w:sz w:val="24"/>
+          <w:szCs w:val="24"/>
+        </w:rPr>
+        <w:t>perhatian</w:t>
+      </w:r>
+      <w:proofErr w:type="spellEnd"/>
+      <w:r>
+        <w:rPr>
+          <w:rFonts w:ascii="Times New Roman" w:hAnsi="Times New Roman" w:cs="Times New Roman"/>
+          <w:sz w:val="24"/>
+          <w:szCs w:val="24"/>
+        </w:rPr>
+        <w:t xml:space="preserve"> dan </w:t>
+      </w:r>
+      <w:proofErr w:type="spellStart"/>
+      <w:r>
+        <w:rPr>
+          <w:rFonts w:ascii="Times New Roman" w:hAnsi="Times New Roman" w:cs="Times New Roman"/>
+          <w:sz w:val="24"/>
+          <w:szCs w:val="24"/>
+        </w:rPr>
+        <w:t>kesediaan</w:t>
+      </w:r>
+      <w:proofErr w:type="spellEnd"/>
+      <w:r>
+        <w:rPr>
+          <w:rFonts w:ascii="Times New Roman" w:hAnsi="Times New Roman" w:cs="Times New Roman"/>
+          <w:sz w:val="24"/>
+          <w:szCs w:val="24"/>
+        </w:rPr>
+        <w:t xml:space="preserve"> </w:t>
       </w:r>
       <w:r>
         <w:rPr>
@@ -900,7 +2002,61 @@
           <w:sz w:val="24"/>
           <w:szCs w:val="24"/>
         </w:rPr>
-        <w:t>, kami ucapkan terima kasih.</w:t>
+        <w:t xml:space="preserve">, kami </w:t>
+      </w:r>
+      <w:proofErr w:type="spellStart"/>
+      <w:r>
+        <w:rPr>
+          <w:rFonts w:ascii="Times New Roman" w:hAnsi="Times New Roman" w:cs="Times New Roman"/>
+          <w:sz w:val="24"/>
+          <w:szCs w:val="24"/>
+        </w:rPr>
+        <w:t>ucapkan</w:t>
+      </w:r>
+      <w:proofErr w:type="spellEnd"/>
+      <w:r>
+        <w:rPr>
+          <w:rFonts w:ascii="Times New Roman" w:hAnsi="Times New Roman" w:cs="Times New Roman"/>
+          <w:sz w:val="24"/>
+          <w:szCs w:val="24"/>
+        </w:rPr>
+        <w:t xml:space="preserve"> </w:t>
+      </w:r>
+      <w:proofErr w:type="spellStart"/>
+      <w:r>
+        <w:rPr>
+          <w:rFonts w:ascii="Times New Roman" w:hAnsi="Times New Roman" w:cs="Times New Roman"/>
+          <w:sz w:val="24"/>
+          <w:szCs w:val="24"/>
+        </w:rPr>
+        <w:t>terima</w:t>
+      </w:r>
+      <w:proofErr w:type="spellEnd"/>
+      <w:r>
+        <w:rPr>
+          <w:rFonts w:ascii="Times New Roman" w:hAnsi="Times New Roman" w:cs="Times New Roman"/>
+          <w:sz w:val="24"/>
+          <w:szCs w:val="24"/>
+        </w:rPr>
+        <w:t xml:space="preserve"> </w:t>
+      </w:r>
+      <w:proofErr w:type="spellStart"/>
+      <w:r>
+        <w:rPr>
+          <w:rFonts w:ascii="Times New Roman" w:hAnsi="Times New Roman" w:cs="Times New Roman"/>
+          <w:sz w:val="24"/>
+          <w:szCs w:val="24"/>
+        </w:rPr>
+        <w:t>kasih</w:t>
+      </w:r>
+      <w:proofErr w:type="spellEnd"/>
+      <w:r>
+        <w:rPr>
+          <w:rFonts w:ascii="Times New Roman" w:hAnsi="Times New Roman" w:cs="Times New Roman"/>
+          <w:sz w:val="24"/>
+          <w:szCs w:val="24"/>
+        </w:rPr>
+        <w:t>.</w:t>
       </w:r>
     </w:p>
     <w:p>
@@ -1034,7 +2190,59 @@
           <w:szCs w:val="24"/>
         </w:rPr>
         <w:tab/>
-        <w:t xml:space="preserve">  Ketua Program Studi Informatika,</w:t>
+        <w:t xml:space="preserve">  </w:t>
+      </w:r>
+      <w:proofErr w:type="spellStart"/>
+      <w:r>
+        <w:rPr>
+          <w:rFonts w:ascii="Times New Roman" w:hAnsi="Times New Roman" w:cs="Times New Roman"/>
+          <w:sz w:val="24"/>
+          <w:szCs w:val="24"/>
+        </w:rPr>
+        <w:t>Ketua</w:t>
+      </w:r>
+      <w:proofErr w:type="spellEnd"/>
+      <w:r>
+        <w:rPr>
+          <w:rFonts w:ascii="Times New Roman" w:hAnsi="Times New Roman" w:cs="Times New Roman"/>
+          <w:sz w:val="24"/>
+          <w:szCs w:val="24"/>
+        </w:rPr>
+        <w:t xml:space="preserve"> Program Studi </w:t>
+      </w:r>
+      <w:r>
+        <w:rPr>
+          <w:rFonts w:ascii="Times New Roman" w:hAnsi="Times New Roman" w:cs="Times New Roman"/>
+          <w:sz w:val="24"/>
+          <w:szCs w:val="24"/>
+        </w:rPr>
+        <w:t>{{</w:t>
+      </w:r>
+      <w:proofErr w:type="spellStart"/>
+      <w:r>
+        <w:rPr>
+          <w:rFonts w:ascii="Times New Roman" w:hAnsi="Times New Roman" w:cs="Times New Roman"/>
+          <w:sz w:val="24"/>
+          <w:szCs w:val="24"/>
+        </w:rPr>
+        <w:t>prodi</w:t>
+      </w:r>
+      <w:proofErr w:type="spellEnd"/>
+      <w:r>
+        <w:rPr>
+          <w:rFonts w:ascii="Times New Roman" w:hAnsi="Times New Roman" w:cs="Times New Roman"/>
+          <w:sz w:val="24"/>
+          <w:szCs w:val="24"/>
+        </w:rPr>
+        <w:t>}}</w:t>
+      </w:r>
+      <w:r>
+        <w:rPr>
+          <w:rFonts w:ascii="Times New Roman" w:hAnsi="Times New Roman" w:cs="Times New Roman"/>
+          <w:sz w:val="24"/>
+          <w:szCs w:val="24"/>
+        </w:rPr>
+        <w:t>,</w:t>
       </w:r>
     </w:p>
     <w:p>
@@ -1067,7 +2275,7 @@
           <w:szCs w:val="24"/>
           <w:lang w:val="id-ID" w:eastAsia="id-ID" w:bidi="ar-SA"/>
         </w:rPr>
-        <w:t xml:space="preserve">                                                                                                       </w:t>
+        <w:t xml:space="preserve">                                                                                                 </w:t>
       </w:r>
       <w:r>
         <w:rPr>
@@ -1077,7 +2285,7 @@
           <w:szCs w:val="24"/>
           <w:lang w:val="id-ID" w:eastAsia="id-ID" w:bidi="ar-SA"/>
         </w:rPr>
-        <w:tab/>
+        <w:t>{{ttd_kaprodi}}</w:t>
       </w:r>
     </w:p>
     <w:p>
@@ -1176,7 +2384,29 @@
           <w:szCs w:val="24"/>
           <w:u w:val="single"/>
         </w:rPr>
-        <w:t>&lt;&lt;Nama Kaprodi&gt;&gt;</w:t>
+        <w:t>{{</w:t>
+      </w:r>
+      <w:proofErr w:type="spellStart"/>
+      <w:r>
+        <w:rPr>
+          <w:rFonts w:ascii="Times New Roman" w:hAnsi="Times New Roman" w:cs="Times New Roman"/>
+          <w:b/>
+          <w:sz w:val="24"/>
+          <w:szCs w:val="24"/>
+          <w:u w:val="single"/>
+        </w:rPr>
+        <w:t>nama_kaprodi</w:t>
+      </w:r>
+      <w:proofErr w:type="spellEnd"/>
+      <w:r>
+        <w:rPr>
+          <w:rFonts w:ascii="Times New Roman" w:hAnsi="Times New Roman" w:cs="Times New Roman"/>
+          <w:b/>
+          <w:sz w:val="24"/>
+          <w:szCs w:val="24"/>
+          <w:u w:val="single"/>
+        </w:rPr>
+        <w:t>}}</w:t>
       </w:r>
     </w:p>
     <w:p>
@@ -1193,6 +2423,8 @@
           <w:szCs w:val="24"/>
         </w:rPr>
       </w:pPr>
+      <w:proofErr w:type="spellStart"/>
+      <w:proofErr w:type="gramStart"/>
       <w:r>
         <w:rPr>
           <w:rFonts w:ascii="Times New Roman" w:hAnsi="Times New Roman" w:cs="Times New Roman"/>
@@ -1203,6 +2435,7 @@
         </w:rPr>
         <w:t>Tembusan</w:t>
       </w:r>
+      <w:proofErr w:type="spellEnd"/>
       <w:r>
         <w:rPr>
           <w:rFonts w:ascii="Times New Roman" w:hAnsi="Times New Roman" w:cs="Times New Roman"/>
@@ -1212,6 +2445,7 @@
         </w:rPr>
         <w:t xml:space="preserve"> :</w:t>
       </w:r>
+      <w:proofErr w:type="gramEnd"/>
     </w:p>
     <w:p>
       <w:pPr>
@@ -1223,14 +2457,34 @@
           <w:szCs w:val="24"/>
         </w:rPr>
       </w:pPr>
-      <w:r>
-        <w:rPr>
-          <w:rFonts w:ascii="Times New Roman" w:hAnsi="Times New Roman" w:cs="Times New Roman"/>
-          <w:sz w:val="24"/>
-          <w:szCs w:val="24"/>
-        </w:rPr>
-        <w:t>Yth. Sdr</w:t>
-      </w:r>
+      <w:proofErr w:type="spellStart"/>
+      <w:r>
+        <w:rPr>
+          <w:rFonts w:ascii="Times New Roman" w:hAnsi="Times New Roman" w:cs="Times New Roman"/>
+          <w:sz w:val="24"/>
+          <w:szCs w:val="24"/>
+        </w:rPr>
+        <w:t>Yth</w:t>
+      </w:r>
+      <w:proofErr w:type="spellEnd"/>
+      <w:r>
+        <w:rPr>
+          <w:rFonts w:ascii="Times New Roman" w:hAnsi="Times New Roman" w:cs="Times New Roman"/>
+          <w:sz w:val="24"/>
+          <w:szCs w:val="24"/>
+        </w:rPr>
+        <w:t xml:space="preserve">. </w:t>
+      </w:r>
+      <w:proofErr w:type="spellStart"/>
+      <w:r>
+        <w:rPr>
+          <w:rFonts w:ascii="Times New Roman" w:hAnsi="Times New Roman" w:cs="Times New Roman"/>
+          <w:sz w:val="24"/>
+          <w:szCs w:val="24"/>
+        </w:rPr>
+        <w:t>Sdr</w:t>
+      </w:r>
+      <w:proofErr w:type="spellEnd"/>
       <w:r>
         <w:rPr>
           <w:rFonts w:ascii="Times New Roman" w:hAnsi="Times New Roman" w:cs="Times New Roman"/>
@@ -1249,8 +2503,6 @@
         <w:tab/>
         <w:t>:</w:t>
       </w:r>
-      <w:bookmarkStart w:id="0" w:name="_GoBack"/>
-      <w:bookmarkEnd w:id="0"/>
       <w:r>
         <w:rPr>
           <w:rFonts w:ascii="Times New Roman" w:hAnsi="Times New Roman" w:cs="Times New Roman"/>
@@ -1259,6 +2511,35 @@
           <w:szCs w:val="24"/>
         </w:rPr>
         <w:t xml:space="preserve"> </w:t>
+      </w:r>
+      <w:r>
+        <w:rPr>
+          <w:rFonts w:ascii="Times New Roman" w:hAnsi="Times New Roman" w:cs="Times New Roman"/>
+          <w:bCs/>
+          <w:sz w:val="24"/>
+          <w:szCs w:val="24"/>
+        </w:rPr>
+        <w:t>{{</w:t>
+      </w:r>
+      <w:proofErr w:type="spellStart"/>
+      <w:r>
+        <w:rPr>
+          <w:rFonts w:ascii="Times New Roman" w:hAnsi="Times New Roman" w:cs="Times New Roman"/>
+          <w:bCs/>
+          <w:sz w:val="24"/>
+          <w:szCs w:val="24"/>
+        </w:rPr>
+        <w:t>nama_mahasiswa</w:t>
+      </w:r>
+      <w:proofErr w:type="spellEnd"/>
+      <w:r>
+        <w:rPr>
+          <w:rFonts w:ascii="Times New Roman" w:hAnsi="Times New Roman" w:cs="Times New Roman"/>
+          <w:bCs/>
+          <w:sz w:val="24"/>
+          <w:szCs w:val="24"/>
+        </w:rPr>
+        <w:t>}}</w:t>
       </w:r>
     </w:p>
     <w:p>
@@ -1303,6 +2584,35 @@
           <w:lang w:val="id-ID"/>
         </w:rPr>
         <w:t xml:space="preserve"> </w:t>
+      </w:r>
+      <w:r>
+        <w:rPr>
+          <w:rFonts w:ascii="Times New Roman" w:hAnsi="Times New Roman" w:cs="Times New Roman"/>
+          <w:sz w:val="24"/>
+          <w:szCs w:val="24"/>
+          <w:lang w:val="id-ID"/>
+        </w:rPr>
+        <w:t>{{</w:t>
+      </w:r>
+      <w:proofErr w:type="spellStart"/>
+      <w:r>
+        <w:rPr>
+          <w:rFonts w:ascii="Times New Roman" w:hAnsi="Times New Roman" w:cs="Times New Roman"/>
+          <w:sz w:val="24"/>
+          <w:szCs w:val="24"/>
+          <w:lang w:val="id-ID"/>
+        </w:rPr>
+        <w:t>npm</w:t>
+      </w:r>
+      <w:proofErr w:type="spellEnd"/>
+      <w:r>
+        <w:rPr>
+          <w:rFonts w:ascii="Times New Roman" w:hAnsi="Times New Roman" w:cs="Times New Roman"/>
+          <w:sz w:val="24"/>
+          <w:szCs w:val="24"/>
+          <w:lang w:val="id-ID"/>
+        </w:rPr>
+        <w:t>}}</w:t>
       </w:r>
     </w:p>
     <w:p>
@@ -1320,14 +2630,52 @@
           <w:szCs w:val="24"/>
         </w:rPr>
       </w:pPr>
-      <w:r>
-        <w:rPr>
-          <w:rFonts w:ascii="Times New Roman" w:hAnsi="Times New Roman" w:cs="Times New Roman"/>
-          <w:sz w:val="24"/>
-          <w:szCs w:val="24"/>
-        </w:rPr>
-        <w:t>Pakaian Penguji dan Mahasiswa</w:t>
-      </w:r>
+      <w:proofErr w:type="spellStart"/>
+      <w:r>
+        <w:rPr>
+          <w:rFonts w:ascii="Times New Roman" w:hAnsi="Times New Roman" w:cs="Times New Roman"/>
+          <w:sz w:val="24"/>
+          <w:szCs w:val="24"/>
+        </w:rPr>
+        <w:t>Pakaian</w:t>
+      </w:r>
+      <w:proofErr w:type="spellEnd"/>
+      <w:r>
+        <w:rPr>
+          <w:rFonts w:ascii="Times New Roman" w:hAnsi="Times New Roman" w:cs="Times New Roman"/>
+          <w:sz w:val="24"/>
+          <w:szCs w:val="24"/>
+        </w:rPr>
+        <w:t xml:space="preserve"> </w:t>
+      </w:r>
+      <w:proofErr w:type="spellStart"/>
+      <w:r>
+        <w:rPr>
+          <w:rFonts w:ascii="Times New Roman" w:hAnsi="Times New Roman" w:cs="Times New Roman"/>
+          <w:sz w:val="24"/>
+          <w:szCs w:val="24"/>
+        </w:rPr>
+        <w:t>Penguji</w:t>
+      </w:r>
+      <w:proofErr w:type="spellEnd"/>
+      <w:r>
+        <w:rPr>
+          <w:rFonts w:ascii="Times New Roman" w:hAnsi="Times New Roman" w:cs="Times New Roman"/>
+          <w:sz w:val="24"/>
+          <w:szCs w:val="24"/>
+        </w:rPr>
+        <w:t xml:space="preserve"> dan </w:t>
+      </w:r>
+      <w:proofErr w:type="spellStart"/>
+      <w:r>
+        <w:rPr>
+          <w:rFonts w:ascii="Times New Roman" w:hAnsi="Times New Roman" w:cs="Times New Roman"/>
+          <w:sz w:val="24"/>
+          <w:szCs w:val="24"/>
+        </w:rPr>
+        <w:t>Mahasiswa</w:t>
+      </w:r>
+      <w:proofErr w:type="spellEnd"/>
       <w:r>
         <w:rPr>
           <w:rFonts w:ascii="Times New Roman" w:hAnsi="Times New Roman" w:cs="Times New Roman"/>
@@ -1386,8 +2734,54 @@
           <w:szCs w:val="24"/>
         </w:rPr>
         <w:tab/>
-        <w:t>: Pakaian Sipil Lengkap</w:t>
-      </w:r>
+        <w:t xml:space="preserve">: </w:t>
+      </w:r>
+      <w:proofErr w:type="spellStart"/>
+      <w:r>
+        <w:rPr>
+          <w:rFonts w:ascii="Times New Roman" w:hAnsi="Times New Roman" w:cs="Times New Roman"/>
+          <w:sz w:val="24"/>
+          <w:szCs w:val="24"/>
+        </w:rPr>
+        <w:t>Pakaian</w:t>
+      </w:r>
+      <w:proofErr w:type="spellEnd"/>
+      <w:r>
+        <w:rPr>
+          <w:rFonts w:ascii="Times New Roman" w:hAnsi="Times New Roman" w:cs="Times New Roman"/>
+          <w:sz w:val="24"/>
+          <w:szCs w:val="24"/>
+        </w:rPr>
+        <w:t xml:space="preserve"> </w:t>
+      </w:r>
+      <w:proofErr w:type="spellStart"/>
+      <w:r>
+        <w:rPr>
+          <w:rFonts w:ascii="Times New Roman" w:hAnsi="Times New Roman" w:cs="Times New Roman"/>
+          <w:sz w:val="24"/>
+          <w:szCs w:val="24"/>
+        </w:rPr>
+        <w:t>Sipil</w:t>
+      </w:r>
+      <w:proofErr w:type="spellEnd"/>
+      <w:r>
+        <w:rPr>
+          <w:rFonts w:ascii="Times New Roman" w:hAnsi="Times New Roman" w:cs="Times New Roman"/>
+          <w:sz w:val="24"/>
+          <w:szCs w:val="24"/>
+        </w:rPr>
+        <w:t xml:space="preserve"> </w:t>
+      </w:r>
+      <w:proofErr w:type="spellStart"/>
+      <w:r>
+        <w:rPr>
+          <w:rFonts w:ascii="Times New Roman" w:hAnsi="Times New Roman" w:cs="Times New Roman"/>
+          <w:sz w:val="24"/>
+          <w:szCs w:val="24"/>
+        </w:rPr>
+        <w:t>Lengkap</w:t>
+      </w:r>
+      <w:proofErr w:type="spellEnd"/>
       <w:r>
         <w:rPr>
           <w:rFonts w:ascii="Times New Roman" w:hAnsi="Times New Roman" w:cs="Times New Roman"/>
@@ -1431,8 +2825,19 @@
           <w:szCs w:val="24"/>
           <w:lang w:val="id-ID"/>
         </w:rPr>
-        <w:t>Business Dress</w:t>
-      </w:r>
+        <w:t xml:space="preserve">Business </w:t>
+      </w:r>
+      <w:proofErr w:type="spellStart"/>
+      <w:r>
+        <w:rPr>
+          <w:rFonts w:ascii="Times New Roman" w:hAnsi="Times New Roman" w:cs="Times New Roman"/>
+          <w:sz w:val="24"/>
+          <w:szCs w:val="24"/>
+          <w:lang w:val="id-ID"/>
+        </w:rPr>
+        <w:t>Dress</w:t>
+      </w:r>
+      <w:proofErr w:type="spellEnd"/>
       <w:r>
         <w:t xml:space="preserve"> </w:t>
       </w:r>
@@ -1450,7 +2855,7 @@
 </file>
 
 <file path=word/endnotes.xml><?xml version="1.0" encoding="utf-8"?>
-<w:endnotes xmlns:wpc="http://schemas.microsoft.com/office/word/2010/wordprocessingCanvas" xmlns:cx="http://schemas.microsoft.com/office/drawing/2014/chartex" xmlns:cx1="http://schemas.microsoft.com/office/drawing/2015/9/8/chartex" xmlns:cx2="http://schemas.microsoft.com/office/drawing/2015/10/21/chartex" xmlns:cx3="http://schemas.microsoft.com/office/drawing/2016/5/9/chartex" xmlns:cx4="http://schemas.microsoft.com/office/drawing/2016/5/10/chartex" xmlns:cx5="http://schemas.microsoft.com/office/drawing/2016/5/11/chartex" xmlns:cx6="http://schemas.microsoft.com/office/drawing/2016/5/12/chartex" xmlns:cx7="http://schemas.microsoft.com/office/drawing/2016/5/13/chartex" xmlns:cx8="http://schemas.microsoft.com/office/drawing/2016/5/14/chartex" xmlns:mc="http://schemas.openxmlformats.org/markup-compatibility/2006" xmlns:aink="http://schemas.microsoft.com/office/drawing/2016/ink" xmlns:am3d="http://schemas.microsoft.com/office/drawing/2017/model3d" xmlns:o="urn:schemas-microsoft-com:office:office" xmlns:r="http://schemas.openxmlformats.org/officeDocument/2006/relationships" xmlns:m="http://schemas.openxmlformats.org/officeDocument/2006/math" xmlns:v="urn:schemas-microsoft-com:vml" xmlns:wp14="http://schemas.microsoft.com/office/word/2010/wordprocessingDrawing" xmlns:wp="http://schemas.openxmlformats.org/drawingml/2006/wordprocessingDrawing" xmlns:w10="urn:schemas-microsoft-com:office:word" xmlns:w="http://schemas.openxmlformats.org/wordprocessingml/2006/main" xmlns:w14="http://schemas.microsoft.com/office/word/2010/wordml" xmlns:w15="http://schemas.microsoft.com/office/word/2012/wordml" xmlns:w16cid="http://schemas.microsoft.com/office/word/2016/wordml/cid" xmlns:w16se="http://schemas.microsoft.com/office/word/2015/wordml/symex" xmlns:wpg="http://schemas.microsoft.com/office/word/2010/wordprocessingGroup" xmlns:wpi="http://schemas.microsoft.com/office/word/2010/wordprocessingInk" xmlns:wne="http://schemas.microsoft.com/office/word/2006/wordml" xmlns:wps="http://schemas.microsoft.com/office/word/2010/wordprocessingShape" mc:Ignorable="w14 w15 w16se w16cid wp14">
+<w:endnotes xmlns:wpc="http://schemas.microsoft.com/office/word/2010/wordprocessingCanvas" xmlns:cx="http://schemas.microsoft.com/office/drawing/2014/chartex" xmlns:cx1="http://schemas.microsoft.com/office/drawing/2015/9/8/chartex" xmlns:cx2="http://schemas.microsoft.com/office/drawing/2015/10/21/chartex" xmlns:cx3="http://schemas.microsoft.com/office/drawing/2016/5/9/chartex" xmlns:cx4="http://schemas.microsoft.com/office/drawing/2016/5/10/chartex" xmlns:cx5="http://schemas.microsoft.com/office/drawing/2016/5/11/chartex" xmlns:cx6="http://schemas.microsoft.com/office/drawing/2016/5/12/chartex" xmlns:cx7="http://schemas.microsoft.com/office/drawing/2016/5/13/chartex" xmlns:cx8="http://schemas.microsoft.com/office/drawing/2016/5/14/chartex" xmlns:mc="http://schemas.openxmlformats.org/markup-compatibility/2006" xmlns:aink="http://schemas.microsoft.com/office/drawing/2016/ink" xmlns:am3d="http://schemas.microsoft.com/office/drawing/2017/model3d" xmlns:o="urn:schemas-microsoft-com:office:office" xmlns:oel="http://schemas.microsoft.com/office/2019/extlst" xmlns:r="http://schemas.openxmlformats.org/officeDocument/2006/relationships" xmlns:m="http://schemas.openxmlformats.org/officeDocument/2006/math" xmlns:v="urn:schemas-microsoft-com:vml" xmlns:wp14="http://schemas.microsoft.com/office/word/2010/wordprocessingDrawing" xmlns:wp="http://schemas.openxmlformats.org/drawingml/2006/wordprocessingDrawing" xmlns:w10="urn:schemas-microsoft-com:office:word" xmlns:w="http://schemas.openxmlformats.org/wordprocessingml/2006/main" xmlns:w14="http://schemas.microsoft.com/office/word/2010/wordml" xmlns:w15="http://schemas.microsoft.com/office/word/2012/wordml" xmlns:w16cex="http://schemas.microsoft.com/office/word/2018/wordml/cex" xmlns:w16cid="http://schemas.microsoft.com/office/word/2016/wordml/cid" xmlns:w16="http://schemas.microsoft.com/office/word/2018/wordml" xmlns:w16du="http://schemas.microsoft.com/office/word/2023/wordml/word16du" xmlns:w16sdtdh="http://schemas.microsoft.com/office/word/2020/wordml/sdtdatahash" xmlns:w16sdtfl="http://schemas.microsoft.com/office/word/2024/wordml/sdtformatlock" xmlns:w16se="http://schemas.microsoft.com/office/word/2015/wordml/symex" xmlns:wpg="http://schemas.microsoft.com/office/word/2010/wordprocessingGroup" xmlns:wpi="http://schemas.microsoft.com/office/word/2010/wordprocessingInk" xmlns:wne="http://schemas.microsoft.com/office/word/2006/wordml" xmlns:wps="http://schemas.microsoft.com/office/word/2010/wordprocessingShape" mc:Ignorable="w14 w15 w16se w16cid w16 w16cex w16sdtdh w16sdtfl w16du wp14">
   <w:endnote w:type="separator" w:id="-1">
     <w:p>
       <w:pPr>
@@ -1475,7 +2880,7 @@
 </file>
 
 <file path=word/footnotes.xml><?xml version="1.0" encoding="utf-8"?>
-<w:footnotes xmlns:wpc="http://schemas.microsoft.com/office/word/2010/wordprocessingCanvas" xmlns:cx="http://schemas.microsoft.com/office/drawing/2014/chartex" xmlns:cx1="http://schemas.microsoft.com/office/drawing/2015/9/8/chartex" xmlns:cx2="http://schemas.microsoft.com/office/drawing/2015/10/21/chartex" xmlns:cx3="http://schemas.microsoft.com/office/drawing/2016/5/9/chartex" xmlns:cx4="http://schemas.microsoft.com/office/drawing/2016/5/10/chartex" xmlns:cx5="http://schemas.microsoft.com/office/drawing/2016/5/11/chartex" xmlns:cx6="http://schemas.microsoft.com/office/drawing/2016/5/12/chartex" xmlns:cx7="http://schemas.microsoft.com/office/drawing/2016/5/13/chartex" xmlns:cx8="http://schemas.microsoft.com/office/drawing/2016/5/14/chartex" xmlns:mc="http://schemas.openxmlformats.org/markup-compatibility/2006" xmlns:aink="http://schemas.microsoft.com/office/drawing/2016/ink" xmlns:am3d="http://schemas.microsoft.com/office/drawing/2017/model3d" xmlns:o="urn:schemas-microsoft-com:office:office" xmlns:r="http://schemas.openxmlformats.org/officeDocument/2006/relationships" xmlns:m="http://schemas.openxmlformats.org/officeDocument/2006/math" xmlns:v="urn:schemas-microsoft-com:vml" xmlns:wp14="http://schemas.microsoft.com/office/word/2010/wordprocessingDrawing" xmlns:wp="http://schemas.openxmlformats.org/drawingml/2006/wordprocessingDrawing" xmlns:w10="urn:schemas-microsoft-com:office:word" xmlns:w="http://schemas.openxmlformats.org/wordprocessingml/2006/main" xmlns:w14="http://schemas.microsoft.com/office/word/2010/wordml" xmlns:w15="http://schemas.microsoft.com/office/word/2012/wordml" xmlns:w16cid="http://schemas.microsoft.com/office/word/2016/wordml/cid" xmlns:w16se="http://schemas.microsoft.com/office/word/2015/wordml/symex" xmlns:wpg="http://schemas.microsoft.com/office/word/2010/wordprocessingGroup" xmlns:wpi="http://schemas.microsoft.com/office/word/2010/wordprocessingInk" xmlns:wne="http://schemas.microsoft.com/office/word/2006/wordml" xmlns:wps="http://schemas.microsoft.com/office/word/2010/wordprocessingShape" mc:Ignorable="w14 w15 w16se w16cid wp14">
+<w:footnotes xmlns:wpc="http://schemas.microsoft.com/office/word/2010/wordprocessingCanvas" xmlns:cx="http://schemas.microsoft.com/office/drawing/2014/chartex" xmlns:cx1="http://schemas.microsoft.com/office/drawing/2015/9/8/chartex" xmlns:cx2="http://schemas.microsoft.com/office/drawing/2015/10/21/chartex" xmlns:cx3="http://schemas.microsoft.com/office/drawing/2016/5/9/chartex" xmlns:cx4="http://schemas.microsoft.com/office/drawing/2016/5/10/chartex" xmlns:cx5="http://schemas.microsoft.com/office/drawing/2016/5/11/chartex" xmlns:cx6="http://schemas.microsoft.com/office/drawing/2016/5/12/chartex" xmlns:cx7="http://schemas.microsoft.com/office/drawing/2016/5/13/chartex" xmlns:cx8="http://schemas.microsoft.com/office/drawing/2016/5/14/chartex" xmlns:mc="http://schemas.openxmlformats.org/markup-compatibility/2006" xmlns:aink="http://schemas.microsoft.com/office/drawing/2016/ink" xmlns:am3d="http://schemas.microsoft.com/office/drawing/2017/model3d" xmlns:o="urn:schemas-microsoft-com:office:office" xmlns:oel="http://schemas.microsoft.com/office/2019/extlst" xmlns:r="http://schemas.openxmlformats.org/officeDocument/2006/relationships" xmlns:m="http://schemas.openxmlformats.org/officeDocument/2006/math" xmlns:v="urn:schemas-microsoft-com:vml" xmlns:wp14="http://schemas.microsoft.com/office/word/2010/wordprocessingDrawing" xmlns:wp="http://schemas.openxmlformats.org/drawingml/2006/wordprocessingDrawing" xmlns:w10="urn:schemas-microsoft-com:office:word" xmlns:w="http://schemas.openxmlformats.org/wordprocessingml/2006/main" xmlns:w14="http://schemas.microsoft.com/office/word/2010/wordml" xmlns:w15="http://schemas.microsoft.com/office/word/2012/wordml" xmlns:w16cex="http://schemas.microsoft.com/office/word/2018/wordml/cex" xmlns:w16cid="http://schemas.microsoft.com/office/word/2016/wordml/cid" xmlns:w16="http://schemas.microsoft.com/office/word/2018/wordml" xmlns:w16du="http://schemas.microsoft.com/office/word/2023/wordml/word16du" xmlns:w16sdtdh="http://schemas.microsoft.com/office/word/2020/wordml/sdtdatahash" xmlns:w16sdtfl="http://schemas.microsoft.com/office/word/2024/wordml/sdtformatlock" xmlns:w16se="http://schemas.microsoft.com/office/word/2015/wordml/symex" xmlns:wpg="http://schemas.microsoft.com/office/word/2010/wordprocessingGroup" xmlns:wpi="http://schemas.microsoft.com/office/word/2010/wordprocessingInk" xmlns:wne="http://schemas.microsoft.com/office/word/2006/wordml" xmlns:wps="http://schemas.microsoft.com/office/word/2010/wordprocessingShape" mc:Ignorable="w14 w15 w16se w16cid w16 w16cex w16sdtdh w16sdtfl w16du wp14">
   <w:footnote w:type="separator" w:id="-1">
     <w:p>
       <w:pPr>
@@ -1500,7 +2905,7 @@
 </file>
 
 <file path=word/header1.xml><?xml version="1.0" encoding="utf-8"?>
-<w:hdr xmlns:wpc="http://schemas.microsoft.com/office/word/2010/wordprocessingCanvas" xmlns:cx="http://schemas.microsoft.com/office/drawing/2014/chartex" xmlns:cx1="http://schemas.microsoft.com/office/drawing/2015/9/8/chartex" xmlns:cx2="http://schemas.microsoft.com/office/drawing/2015/10/21/chartex" xmlns:cx3="http://schemas.microsoft.com/office/drawing/2016/5/9/chartex" xmlns:cx4="http://schemas.microsoft.com/office/drawing/2016/5/10/chartex" xmlns:cx5="http://schemas.microsoft.com/office/drawing/2016/5/11/chartex" xmlns:cx6="http://schemas.microsoft.com/office/drawing/2016/5/12/chartex" xmlns:cx7="http://schemas.microsoft.com/office/drawing/2016/5/13/chartex" xmlns:cx8="http://schemas.microsoft.com/office/drawing/2016/5/14/chartex" xmlns:mc="http://schemas.openxmlformats.org/markup-compatibility/2006" xmlns:aink="http://schemas.microsoft.com/office/drawing/2016/ink" xmlns:am3d="http://schemas.microsoft.com/office/drawing/2017/model3d" xmlns:o="urn:schemas-microsoft-com:office:office" xmlns:r="http://schemas.openxmlformats.org/officeDocument/2006/relationships" xmlns:m="http://schemas.openxmlformats.org/officeDocument/2006/math" xmlns:v="urn:schemas-microsoft-com:vml" xmlns:wp14="http://schemas.microsoft.com/office/word/2010/wordprocessingDrawing" xmlns:wp="http://schemas.openxmlformats.org/drawingml/2006/wordprocessingDrawing" xmlns:w10="urn:schemas-microsoft-com:office:word" xmlns:w="http://schemas.openxmlformats.org/wordprocessingml/2006/main" xmlns:w14="http://schemas.microsoft.com/office/word/2010/wordml" xmlns:w15="http://schemas.microsoft.com/office/word/2012/wordml" xmlns:w16cid="http://schemas.microsoft.com/office/word/2016/wordml/cid" xmlns:w16se="http://schemas.microsoft.com/office/word/2015/wordml/symex" xmlns:wpg="http://schemas.microsoft.com/office/word/2010/wordprocessingGroup" xmlns:wpi="http://schemas.microsoft.com/office/word/2010/wordprocessingInk" xmlns:wne="http://schemas.microsoft.com/office/word/2006/wordml" xmlns:wps="http://schemas.microsoft.com/office/word/2010/wordprocessingShape" mc:Ignorable="w14 w15 w16se w16cid wp14">
+<w:hdr xmlns:wpc="http://schemas.microsoft.com/office/word/2010/wordprocessingCanvas" xmlns:cx="http://schemas.microsoft.com/office/drawing/2014/chartex" xmlns:cx1="http://schemas.microsoft.com/office/drawing/2015/9/8/chartex" xmlns:cx2="http://schemas.microsoft.com/office/drawing/2015/10/21/chartex" xmlns:cx3="http://schemas.microsoft.com/office/drawing/2016/5/9/chartex" xmlns:cx4="http://schemas.microsoft.com/office/drawing/2016/5/10/chartex" xmlns:cx5="http://schemas.microsoft.com/office/drawing/2016/5/11/chartex" xmlns:cx6="http://schemas.microsoft.com/office/drawing/2016/5/12/chartex" xmlns:cx7="http://schemas.microsoft.com/office/drawing/2016/5/13/chartex" xmlns:cx8="http://schemas.microsoft.com/office/drawing/2016/5/14/chartex" xmlns:mc="http://schemas.openxmlformats.org/markup-compatibility/2006" xmlns:aink="http://schemas.microsoft.com/office/drawing/2016/ink" xmlns:am3d="http://schemas.microsoft.com/office/drawing/2017/model3d" xmlns:o="urn:schemas-microsoft-com:office:office" xmlns:oel="http://schemas.microsoft.com/office/2019/extlst" xmlns:r="http://schemas.openxmlformats.org/officeDocument/2006/relationships" xmlns:m="http://schemas.openxmlformats.org/officeDocument/2006/math" xmlns:v="urn:schemas-microsoft-com:vml" xmlns:wp14="http://schemas.microsoft.com/office/word/2010/wordprocessingDrawing" xmlns:wp="http://schemas.openxmlformats.org/drawingml/2006/wordprocessingDrawing" xmlns:w10="urn:schemas-microsoft-com:office:word" xmlns:w="http://schemas.openxmlformats.org/wordprocessingml/2006/main" xmlns:w14="http://schemas.microsoft.com/office/word/2010/wordml" xmlns:w15="http://schemas.microsoft.com/office/word/2012/wordml" xmlns:w16cex="http://schemas.microsoft.com/office/word/2018/wordml/cex" xmlns:w16cid="http://schemas.microsoft.com/office/word/2016/wordml/cid" xmlns:w16="http://schemas.microsoft.com/office/word/2018/wordml" xmlns:w16du="http://schemas.microsoft.com/office/word/2023/wordml/word16du" xmlns:w16sdtdh="http://schemas.microsoft.com/office/word/2020/wordml/sdtdatahash" xmlns:w16sdtfl="http://schemas.microsoft.com/office/word/2024/wordml/sdtformatlock" xmlns:w16se="http://schemas.microsoft.com/office/word/2015/wordml/symex" xmlns:wpg="http://schemas.microsoft.com/office/word/2010/wordprocessingGroup" xmlns:wpi="http://schemas.microsoft.com/office/word/2010/wordprocessingInk" xmlns:wne="http://schemas.microsoft.com/office/word/2006/wordml" xmlns:wps="http://schemas.microsoft.com/office/word/2010/wordprocessingShape" mc:Ignorable="w14 w15 w16se w16cid w16 w16cex w16sdtdh w16sdtfl w16du wp14">
   <w:p>
     <w:pPr>
       <w:pStyle w:val="Header"/>
@@ -1529,7 +2934,7 @@
         <w:lang w:val="en-US" w:eastAsia="en-US" w:bidi="ar-SA"/>
       </w:rPr>
       <w:drawing>
-        <wp:anchor distT="0" distB="0" distL="114300" distR="114300" simplePos="0" relativeHeight="251662336" behindDoc="0" locked="0" layoutInCell="1" allowOverlap="1">
+        <wp:anchor distT="0" distB="0" distL="114300" distR="114300" simplePos="0" relativeHeight="251662336" behindDoc="0" locked="0" layoutInCell="1" allowOverlap="1" wp14:anchorId="6064D836" wp14:editId="17C7712D">
           <wp:simplePos x="0" y="0"/>
           <wp:positionH relativeFrom="column">
             <wp:posOffset>109073</wp:posOffset>
@@ -1711,7 +3116,33 @@
         <w:sz w:val="18"/>
         <w:szCs w:val="18"/>
       </w:rPr>
-      <w:t>Jalan H.O.S. Cokroaminoto No. 445 Telp. 731966 – 742063. Fax. 739191</w:t>
+      <w:t xml:space="preserve">Jalan H.O.S. </w:t>
+    </w:r>
+    <w:proofErr w:type="spellStart"/>
+    <w:r>
+      <w:rPr>
+        <w:rFonts w:ascii="Times New Roman" w:hAnsi="Times New Roman" w:cs="Times New Roman"/>
+        <w:b/>
+        <w:bCs/>
+        <w:color w:val="800080"/>
+        <w:spacing w:val="16"/>
+        <w:sz w:val="18"/>
+        <w:szCs w:val="18"/>
+      </w:rPr>
+      <w:t>Cokroaminoto</w:t>
+    </w:r>
+    <w:proofErr w:type="spellEnd"/>
+    <w:r>
+      <w:rPr>
+        <w:rFonts w:ascii="Times New Roman" w:hAnsi="Times New Roman" w:cs="Times New Roman"/>
+        <w:b/>
+        <w:bCs/>
+        <w:color w:val="800080"/>
+        <w:spacing w:val="16"/>
+        <w:sz w:val="18"/>
+        <w:szCs w:val="18"/>
+      </w:rPr>
+      <w:t xml:space="preserve"> No. 445 Telp. 731966 – 742063. Fax. 739191</w:t>
     </w:r>
   </w:p>
   <w:p>
@@ -1763,7 +3194,7 @@
       <mc:AlternateContent>
         <mc:Choice Requires="wps">
           <w:drawing>
-            <wp:anchor distT="0" distB="0" distL="114300" distR="114300" simplePos="0" relativeHeight="251659264" behindDoc="0" locked="0" layoutInCell="1" allowOverlap="1">
+            <wp:anchor distT="0" distB="0" distL="114300" distR="114300" simplePos="0" relativeHeight="251659264" behindDoc="0" locked="0" layoutInCell="1" allowOverlap="1" wp14:anchorId="594D91DB" wp14:editId="0FE1557B">
               <wp:simplePos x="0" y="0"/>
               <wp:positionH relativeFrom="margin">
                 <wp:posOffset>-1270</wp:posOffset>
@@ -1820,7 +3251,7 @@
         </mc:Choice>
         <mc:Fallback>
           <w:pict>
-            <v:line w14:anchorId="65FC7533" id="Straight Connector 6" o:spid="_x0000_s1026" style="position:absolute;z-index:251659264;visibility:visible;mso-wrap-style:square;mso-width-percent:0;mso-wrap-distance-left:9pt;mso-wrap-distance-top:0;mso-wrap-distance-right:9pt;mso-wrap-distance-bottom:0;mso-position-horizontal:absolute;mso-position-horizontal-relative:margin;mso-position-vertical:absolute;mso-position-vertical-relative:text;mso-width-percent:0;mso-width-relative:margin" from="-.1pt,3.3pt" to="496.8pt,3.3pt" o:gfxdata="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" strokecolor="black [3213]" strokeweight="1.5pt">
+            <v:line w14:anchorId="525C7830" id="Straight Connector 6" o:spid="_x0000_s1026" style="position:absolute;z-index:251659264;visibility:visible;mso-wrap-style:square;mso-width-percent:0;mso-wrap-distance-left:9pt;mso-wrap-distance-top:0;mso-wrap-distance-right:9pt;mso-wrap-distance-bottom:0;mso-position-horizontal:absolute;mso-position-horizontal-relative:margin;mso-position-vertical:absolute;mso-position-vertical-relative:text;mso-width-percent:0;mso-width-relative:margin" from="-.1pt,3.3pt" to="496.8pt,3.3pt" o:gfxdata="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" strokecolor="black [3213]" strokeweight="1.5pt">
               <v:stroke joinstyle="miter"/>
               <w10:wrap anchorx="margin"/>
             </v:line>
@@ -1897,7 +3328,7 @@
         </mc:Choice>
         <mc:Fallback>
           <w:pict>
-            <v:line w14:anchorId="70EC3BE6" id="Straight Connector 7" o:spid="_x0000_s1026" style="position:absolute;z-index:251661312;visibility:visible;mso-wrap-style:square;mso-width-percent:0;mso-wrap-distance-left:9pt;mso-wrap-distance-top:0;mso-wrap-distance-right:9pt;mso-wrap-distance-bottom:0;mso-position-horizontal:absolute;mso-position-horizontal-relative:margin;mso-position-vertical:absolute;mso-position-vertical-relative:text;mso-width-percent:0;mso-width-relative:margin" from=".25pt,5.75pt" to="496.8pt,5.75pt" o:gfxdata="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" strokecolor="black [3213]" strokeweight=".7pt">
+            <v:line w14:anchorId="757CDD86" id="Straight Connector 7" o:spid="_x0000_s1026" style="position:absolute;z-index:251661312;visibility:visible;mso-wrap-style:square;mso-width-percent:0;mso-wrap-distance-left:9pt;mso-wrap-distance-top:0;mso-wrap-distance-right:9pt;mso-wrap-distance-bottom:0;mso-position-horizontal:absolute;mso-position-horizontal-relative:margin;mso-position-vertical:absolute;mso-position-vertical-relative:text;mso-width-percent:0;mso-width-relative:margin" from=".25pt,5.75pt" to="496.8pt,5.75pt" o:gfxdata="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" strokecolor="black [3213]" strokeweight=".7pt">
               <v:stroke joinstyle="miter"/>
               <w10:wrap anchorx="margin"/>
             </v:line>
@@ -1910,7 +3341,7 @@
 </file>
 
 <file path=word/numbering.xml><?xml version="1.0" encoding="utf-8"?>
-<w:numbering xmlns:wpc="http://schemas.microsoft.com/office/word/2010/wordprocessingCanvas" xmlns:cx="http://schemas.microsoft.com/office/drawing/2014/chartex" xmlns:cx1="http://schemas.microsoft.com/office/drawing/2015/9/8/chartex" xmlns:cx2="http://schemas.microsoft.com/office/drawing/2015/10/21/chartex" xmlns:cx3="http://schemas.microsoft.com/office/drawing/2016/5/9/chartex" xmlns:cx4="http://schemas.microsoft.com/office/drawing/2016/5/10/chartex" xmlns:cx5="http://schemas.microsoft.com/office/drawing/2016/5/11/chartex" xmlns:cx6="http://schemas.microsoft.com/office/drawing/2016/5/12/chartex" xmlns:cx7="http://schemas.microsoft.com/office/drawing/2016/5/13/chartex" xmlns:cx8="http://schemas.microsoft.com/office/drawing/2016/5/14/chartex" xmlns:mc="http://schemas.openxmlformats.org/markup-compatibility/2006" xmlns:aink="http://schemas.microsoft.com/office/drawing/2016/ink" xmlns:am3d="http://schemas.microsoft.com/office/drawing/2017/model3d" xmlns:o="urn:schemas-microsoft-com:office:office" xmlns:r="http://schemas.openxmlformats.org/officeDocument/2006/relationships" xmlns:m="http://schemas.openxmlformats.org/officeDocument/2006/math" xmlns:v="urn:schemas-microsoft-com:vml" xmlns:wp14="http://schemas.microsoft.com/office/word/2010/wordprocessingDrawing" xmlns:wp="http://schemas.openxmlformats.org/drawingml/2006/wordprocessingDrawing" xmlns:w10="urn:schemas-microsoft-com:office:word" xmlns:w="http://schemas.openxmlformats.org/wordprocessingml/2006/main" xmlns:w14="http://schemas.microsoft.com/office/word/2010/wordml" xmlns:w15="http://schemas.microsoft.com/office/word/2012/wordml" xmlns:w16cid="http://schemas.microsoft.com/office/word/2016/wordml/cid" xmlns:w16se="http://schemas.microsoft.com/office/word/2015/wordml/symex" xmlns:wpg="http://schemas.microsoft.com/office/word/2010/wordprocessingGroup" xmlns:wpi="http://schemas.microsoft.com/office/word/2010/wordprocessingInk" xmlns:wne="http://schemas.microsoft.com/office/word/2006/wordml" xmlns:wps="http://schemas.microsoft.com/office/word/2010/wordprocessingShape" mc:Ignorable="w14 w15 w16se w16cid wp14">
+<w:numbering xmlns:wpc="http://schemas.microsoft.com/office/word/2010/wordprocessingCanvas" xmlns:cx="http://schemas.microsoft.com/office/drawing/2014/chartex" xmlns:cx1="http://schemas.microsoft.com/office/drawing/2015/9/8/chartex" xmlns:cx2="http://schemas.microsoft.com/office/drawing/2015/10/21/chartex" xmlns:cx3="http://schemas.microsoft.com/office/drawing/2016/5/9/chartex" xmlns:cx4="http://schemas.microsoft.com/office/drawing/2016/5/10/chartex" xmlns:cx5="http://schemas.microsoft.com/office/drawing/2016/5/11/chartex" xmlns:cx6="http://schemas.microsoft.com/office/drawing/2016/5/12/chartex" xmlns:cx7="http://schemas.microsoft.com/office/drawing/2016/5/13/chartex" xmlns:cx8="http://schemas.microsoft.com/office/drawing/2016/5/14/chartex" xmlns:mc="http://schemas.openxmlformats.org/markup-compatibility/2006" xmlns:aink="http://schemas.microsoft.com/office/drawing/2016/ink" xmlns:am3d="http://schemas.microsoft.com/office/drawing/2017/model3d" xmlns:o="urn:schemas-microsoft-com:office:office" xmlns:oel="http://schemas.microsoft.com/office/2019/extlst" xmlns:r="http://schemas.openxmlformats.org/officeDocument/2006/relationships" xmlns:m="http://schemas.openxmlformats.org/officeDocument/2006/math" xmlns:v="urn:schemas-microsoft-com:vml" xmlns:wp14="http://schemas.microsoft.com/office/word/2010/wordprocessingDrawing" xmlns:wp="http://schemas.openxmlformats.org/drawingml/2006/wordprocessingDrawing" xmlns:w10="urn:schemas-microsoft-com:office:word" xmlns:w="http://schemas.openxmlformats.org/wordprocessingml/2006/main" xmlns:w14="http://schemas.microsoft.com/office/word/2010/wordml" xmlns:w15="http://schemas.microsoft.com/office/word/2012/wordml" xmlns:w16cex="http://schemas.microsoft.com/office/word/2018/wordml/cex" xmlns:w16cid="http://schemas.microsoft.com/office/word/2016/wordml/cid" xmlns:w16="http://schemas.microsoft.com/office/word/2018/wordml" xmlns:w16du="http://schemas.microsoft.com/office/word/2023/wordml/word16du" xmlns:w16sdtdh="http://schemas.microsoft.com/office/word/2020/wordml/sdtdatahash" xmlns:w16sdtfl="http://schemas.microsoft.com/office/word/2024/wordml/sdtformatlock" xmlns:w16se="http://schemas.microsoft.com/office/word/2015/wordml/symex" xmlns:wpg="http://schemas.microsoft.com/office/word/2010/wordprocessingGroup" xmlns:wpi="http://schemas.microsoft.com/office/word/2010/wordprocessingInk" xmlns:wne="http://schemas.microsoft.com/office/word/2006/wordml" xmlns:wps="http://schemas.microsoft.com/office/word/2010/wordprocessingShape" mc:Ignorable="w14 w15 w16se w16cid w16 w16cex w16sdtdh w16sdtfl w16du wp14">
   <w:abstractNum w:abstractNumId="0" w15:restartNumberingAfterBreak="0">
     <w:nsid w:val="62A65177"/>
     <w:multiLevelType w:val="hybridMultilevel"/>
@@ -2000,14 +3431,14 @@
       </w:pPr>
     </w:lvl>
   </w:abstractNum>
-  <w:num w:numId="1">
+  <w:num w:numId="1" w16cid:durableId="1136918776">
     <w:abstractNumId w:val="0"/>
   </w:num>
 </w:numbering>
 </file>
 
 <file path=word/styles.xml><?xml version="1.0" encoding="utf-8"?>
-<w:styles xmlns:mc="http://schemas.openxmlformats.org/markup-compatibility/2006" xmlns:r="http://schemas.openxmlformats.org/officeDocument/2006/relationships" xmlns:w="http://schemas.openxmlformats.org/wordprocessingml/2006/main" xmlns:w14="http://schemas.microsoft.com/office/word/2010/wordml" xmlns:w15="http://schemas.microsoft.com/office/word/2012/wordml" xmlns:w16cid="http://schemas.microsoft.com/office/word/2016/wordml/cid" xmlns:w16se="http://schemas.microsoft.com/office/word/2015/wordml/symex" mc:Ignorable="w14 w15 w16se w16cid">
+<w:styles xmlns:mc="http://schemas.openxmlformats.org/markup-compatibility/2006" xmlns:r="http://schemas.openxmlformats.org/officeDocument/2006/relationships" xmlns:w="http://schemas.openxmlformats.org/wordprocessingml/2006/main" xmlns:w14="http://schemas.microsoft.com/office/word/2010/wordml" xmlns:w15="http://schemas.microsoft.com/office/word/2012/wordml" xmlns:w16cex="http://schemas.microsoft.com/office/word/2018/wordml/cex" xmlns:w16cid="http://schemas.microsoft.com/office/word/2016/wordml/cid" xmlns:w16="http://schemas.microsoft.com/office/word/2018/wordml" xmlns:w16du="http://schemas.microsoft.com/office/word/2023/wordml/word16du" xmlns:w16sdtdh="http://schemas.microsoft.com/office/word/2020/wordml/sdtdatahash" xmlns:w16sdtfl="http://schemas.microsoft.com/office/word/2024/wordml/sdtformatlock" xmlns:w16se="http://schemas.microsoft.com/office/word/2015/wordml/symex" mc:Ignorable="w14 w15 w16se w16cid w16 w16cex w16sdtdh w16sdtfl w16du">
   <w:docDefaults>
     <w:rPrDefault>
       <w:rPr>
@@ -2022,7 +3453,7 @@
       </w:pPr>
     </w:pPrDefault>
   </w:docDefaults>
-  <w:latentStyles w:defLockedState="0" w:defUIPriority="99" w:defSemiHidden="0" w:defUnhideWhenUsed="0" w:defQFormat="0" w:count="375">
+  <w:latentStyles w:defLockedState="0" w:defUIPriority="99" w:defSemiHidden="0" w:defUnhideWhenUsed="0" w:defQFormat="0" w:count="376">
     <w:lsdException w:name="Normal" w:uiPriority="0" w:qFormat="1"/>
     <w:lsdException w:name="heading 1" w:uiPriority="0" w:qFormat="1"/>
     <w:lsdException w:name="heading 2" w:semiHidden="1" w:uiPriority="9" w:unhideWhenUsed="1" w:qFormat="1"/>
@@ -2128,6 +3559,7 @@
     <w:lsdException w:name="HTML Sample" w:semiHidden="1" w:unhideWhenUsed="1"/>
     <w:lsdException w:name="HTML Typewriter" w:semiHidden="1" w:unhideWhenUsed="1"/>
     <w:lsdException w:name="HTML Variable" w:semiHidden="1" w:unhideWhenUsed="1"/>
+    <w:lsdException w:name="Normal Table" w:semiHidden="1" w:unhideWhenUsed="1"/>
     <w:lsdException w:name="annotation subject" w:semiHidden="1" w:unhideWhenUsed="1"/>
     <w:lsdException w:name="No List" w:semiHidden="1" w:unhideWhenUsed="1"/>
     <w:lsdException w:name="Outline List 1" w:semiHidden="1" w:unhideWhenUsed="1"/>
@@ -2171,8 +3603,10 @@
     <w:lsdException w:name="Table Elegant" w:semiHidden="1" w:unhideWhenUsed="1"/>
     <w:lsdException w:name="Table Professional" w:semiHidden="1" w:unhideWhenUsed="1"/>
     <w:lsdException w:name="Table Subtle 1" w:semiHidden="1" w:unhideWhenUsed="1"/>
+    <w:lsdException w:name="Table Subtle 2" w:semiHidden="1" w:unhideWhenUsed="1"/>
     <w:lsdException w:name="Table Web 1" w:semiHidden="1" w:unhideWhenUsed="1"/>
     <w:lsdException w:name="Table Web 2" w:semiHidden="1" w:unhideWhenUsed="1"/>
+    <w:lsdException w:name="Table Web 3" w:semiHidden="1" w:unhideWhenUsed="1"/>
     <w:lsdException w:name="Balloon Text" w:semiHidden="1" w:unhideWhenUsed="1"/>
     <w:lsdException w:name="Table Grid" w:uiPriority="39"/>
     <w:lsdException w:name="Table Theme" w:semiHidden="1" w:unhideWhenUsed="1"/>
@@ -2395,6 +3829,7 @@
     <w:lsdException w:name="Smart Hyperlink" w:semiHidden="1" w:unhideWhenUsed="1"/>
     <w:lsdException w:name="Hashtag" w:semiHidden="1" w:unhideWhenUsed="1"/>
     <w:lsdException w:name="Unresolved Mention" w:semiHidden="1" w:unhideWhenUsed="1"/>
+    <w:lsdException w:name="Smart Link" w:semiHidden="1" w:unhideWhenUsed="1"/>
   </w:latentStyles>
   <w:style w:type="paragraph" w:default="1" w:styleId="Normal">
     <w:name w:val="Normal"/>
@@ -2605,6 +4040,25 @@
       <w:i/>
       <w:iCs/>
     </w:rPr>
+  </w:style>
+  <w:style w:type="table" w:styleId="TableGrid">
+    <w:name w:val="Table Grid"/>
+    <w:basedOn w:val="TableNormal"/>
+    <w:uiPriority w:val="39"/>
+    <w:rsid w:val="008C1F01"/>
+    <w:pPr>
+      <w:spacing w:after="0" w:line="240" w:lineRule="auto"/>
+    </w:pPr>
+    <w:tblPr>
+      <w:tblBorders>
+        <w:top w:val="single" w:sz="4" w:space="0" w:color="auto"/>
+        <w:left w:val="single" w:sz="4" w:space="0" w:color="auto"/>
+        <w:bottom w:val="single" w:sz="4" w:space="0" w:color="auto"/>
+        <w:right w:val="single" w:sz="4" w:space="0" w:color="auto"/>
+        <w:insideH w:val="single" w:sz="4" w:space="0" w:color="auto"/>
+        <w:insideV w:val="single" w:sz="4" w:space="0" w:color="auto"/>
+      </w:tblBorders>
+    </w:tblPr>
   </w:style>
 </w:styles>
 </file>

</xml_diff>

<commit_message>
feat: add nomor_surat column to sidang table and implement logic for generating surat undangan number
</commit_message>
<xml_diff>
--- a/src/templates/template_surat_undangan_sidang.docx
+++ b/src/templates/template_surat_undangan_sidang.docx
@@ -1040,6 +1040,7 @@
         <w:rPr>
           <w:rFonts w:ascii="Times New Roman" w:hAnsi="Times New Roman" w:cs="Times New Roman"/>
           <w:b/>
+          <w:bCs/>
           <w:sz w:val="24"/>
           <w:szCs w:val="24"/>
         </w:rPr>
@@ -1080,6 +1081,8 @@
       <w:r>
         <w:rPr>
           <w:rFonts w:ascii="Times New Roman" w:hAnsi="Times New Roman" w:cs="Times New Roman"/>
+          <w:b/>
+          <w:bCs/>
           <w:sz w:val="24"/>
           <w:szCs w:val="24"/>
         </w:rPr>
@@ -1089,6 +1092,8 @@
       <w:r>
         <w:rPr>
           <w:rFonts w:ascii="Times New Roman" w:hAnsi="Times New Roman" w:cs="Times New Roman"/>
+          <w:b/>
+          <w:bCs/>
           <w:sz w:val="24"/>
           <w:szCs w:val="24"/>
         </w:rPr>
@@ -1098,6 +1103,8 @@
       <w:r>
         <w:rPr>
           <w:rFonts w:ascii="Times New Roman" w:hAnsi="Times New Roman" w:cs="Times New Roman"/>
+          <w:b/>
+          <w:bCs/>
           <w:sz w:val="24"/>
           <w:szCs w:val="24"/>
         </w:rPr>
@@ -1221,7 +1228,7 @@
       <w:r>
         <w:rPr>
           <w:rFonts w:ascii="Times New Roman" w:hAnsi="Times New Roman" w:cs="Times New Roman"/>
-          <w:bCs/>
+          <w:b/>
           <w:sz w:val="24"/>
           <w:szCs w:val="24"/>
         </w:rPr>
@@ -1231,7 +1238,7 @@
       <w:r>
         <w:rPr>
           <w:rFonts w:ascii="Times New Roman" w:hAnsi="Times New Roman" w:cs="Times New Roman"/>
-          <w:bCs/>
+          <w:b/>
           <w:sz w:val="24"/>
           <w:szCs w:val="24"/>
         </w:rPr>
@@ -1241,7 +1248,7 @@
       <w:r>
         <w:rPr>
           <w:rFonts w:ascii="Times New Roman" w:hAnsi="Times New Roman" w:cs="Times New Roman"/>
-          <w:bCs/>
+          <w:b/>
           <w:sz w:val="24"/>
           <w:szCs w:val="24"/>
         </w:rPr>
@@ -1441,7 +1448,7 @@
       <w:r>
         <w:rPr>
           <w:rFonts w:ascii="Times New Roman" w:hAnsi="Times New Roman" w:cs="Times New Roman"/>
-          <w:bCs/>
+          <w:b/>
           <w:sz w:val="24"/>
           <w:szCs w:val="24"/>
         </w:rPr>
@@ -1451,26 +1458,17 @@
       <w:r>
         <w:rPr>
           <w:rFonts w:ascii="Times New Roman" w:hAnsi="Times New Roman" w:cs="Times New Roman"/>
-          <w:bCs/>
-          <w:sz w:val="24"/>
-          <w:szCs w:val="24"/>
-        </w:rPr>
-        <w:t>sidang_</w:t>
-      </w:r>
-      <w:r>
-        <w:rPr>
-          <w:rFonts w:ascii="Times New Roman" w:hAnsi="Times New Roman" w:cs="Times New Roman"/>
-          <w:bCs/>
-          <w:sz w:val="24"/>
-          <w:szCs w:val="24"/>
-        </w:rPr>
-        <w:t>date</w:t>
-      </w:r>
-      <w:proofErr w:type="spellEnd"/>
-      <w:r>
-        <w:rPr>
-          <w:rFonts w:ascii="Times New Roman" w:hAnsi="Times New Roman" w:cs="Times New Roman"/>
-          <w:bCs/>
+          <w:b/>
+          <w:sz w:val="24"/>
+          <w:szCs w:val="24"/>
+        </w:rPr>
+        <w:t>sidang_date</w:t>
+      </w:r>
+      <w:proofErr w:type="spellEnd"/>
+      <w:r>
+        <w:rPr>
+          <w:rFonts w:ascii="Times New Roman" w:hAnsi="Times New Roman" w:cs="Times New Roman"/>
+          <w:b/>
           <w:sz w:val="24"/>
           <w:szCs w:val="24"/>
         </w:rPr>
@@ -1483,6 +1481,7 @@
         <w:rPr>
           <w:rFonts w:ascii="Times New Roman" w:hAnsi="Times New Roman" w:cs="Times New Roman"/>
           <w:b/>
+          <w:bCs/>
           <w:sz w:val="24"/>
           <w:szCs w:val="24"/>
         </w:rPr>
@@ -1515,6 +1514,8 @@
       <w:r>
         <w:rPr>
           <w:rFonts w:ascii="Times New Roman" w:hAnsi="Times New Roman" w:cs="Times New Roman"/>
+          <w:b/>
+          <w:bCs/>
           <w:sz w:val="24"/>
           <w:szCs w:val="24"/>
         </w:rPr>
@@ -1524,6 +1525,8 @@
       <w:r>
         <w:rPr>
           <w:rFonts w:ascii="Times New Roman" w:hAnsi="Times New Roman" w:cs="Times New Roman"/>
+          <w:b/>
+          <w:bCs/>
           <w:sz w:val="24"/>
           <w:szCs w:val="24"/>
         </w:rPr>
@@ -1533,6 +1536,8 @@
       <w:r>
         <w:rPr>
           <w:rFonts w:ascii="Times New Roman" w:hAnsi="Times New Roman" w:cs="Times New Roman"/>
+          <w:b/>
+          <w:bCs/>
           <w:sz w:val="24"/>
           <w:szCs w:val="24"/>
         </w:rPr>
@@ -1593,6 +1598,8 @@
       <w:r>
         <w:rPr>
           <w:rFonts w:ascii="Times New Roman" w:hAnsi="Times New Roman" w:cs="Times New Roman"/>
+          <w:b/>
+          <w:bCs/>
           <w:sz w:val="24"/>
           <w:szCs w:val="24"/>
         </w:rPr>
@@ -1602,6 +1609,8 @@
       <w:r>
         <w:rPr>
           <w:rFonts w:ascii="Times New Roman" w:hAnsi="Times New Roman" w:cs="Times New Roman"/>
+          <w:b/>
+          <w:bCs/>
           <w:sz w:val="24"/>
           <w:szCs w:val="24"/>
         </w:rPr>
@@ -1611,6 +1620,8 @@
       <w:r>
         <w:rPr>
           <w:rFonts w:ascii="Times New Roman" w:hAnsi="Times New Roman" w:cs="Times New Roman"/>
+          <w:b/>
+          <w:bCs/>
           <w:sz w:val="24"/>
           <w:szCs w:val="24"/>
         </w:rPr>
@@ -2020,43 +2031,7 @@
           <w:sz w:val="24"/>
           <w:szCs w:val="24"/>
         </w:rPr>
-        <w:t xml:space="preserve"> </w:t>
-      </w:r>
-      <w:proofErr w:type="spellStart"/>
-      <w:r>
-        <w:rPr>
-          <w:rFonts w:ascii="Times New Roman" w:hAnsi="Times New Roman" w:cs="Times New Roman"/>
-          <w:sz w:val="24"/>
-          <w:szCs w:val="24"/>
-        </w:rPr>
-        <w:t>terima</w:t>
-      </w:r>
-      <w:proofErr w:type="spellEnd"/>
-      <w:r>
-        <w:rPr>
-          <w:rFonts w:ascii="Times New Roman" w:hAnsi="Times New Roman" w:cs="Times New Roman"/>
-          <w:sz w:val="24"/>
-          <w:szCs w:val="24"/>
-        </w:rPr>
-        <w:t xml:space="preserve"> </w:t>
-      </w:r>
-      <w:proofErr w:type="spellStart"/>
-      <w:r>
-        <w:rPr>
-          <w:rFonts w:ascii="Times New Roman" w:hAnsi="Times New Roman" w:cs="Times New Roman"/>
-          <w:sz w:val="24"/>
-          <w:szCs w:val="24"/>
-        </w:rPr>
-        <w:t>kasih</w:t>
-      </w:r>
-      <w:proofErr w:type="spellEnd"/>
-      <w:r>
-        <w:rPr>
-          <w:rFonts w:ascii="Times New Roman" w:hAnsi="Times New Roman" w:cs="Times New Roman"/>
-          <w:sz w:val="24"/>
-          <w:szCs w:val="24"/>
-        </w:rPr>
-        <w:t>.</w:t>
+        <w:t xml:space="preserve"> terima kasih.</w:t>
       </w:r>
     </w:p>
     <w:p>
@@ -2515,7 +2490,7 @@
       <w:r>
         <w:rPr>
           <w:rFonts w:ascii="Times New Roman" w:hAnsi="Times New Roman" w:cs="Times New Roman"/>
-          <w:bCs/>
+          <w:b/>
           <w:sz w:val="24"/>
           <w:szCs w:val="24"/>
         </w:rPr>
@@ -2525,7 +2500,7 @@
       <w:r>
         <w:rPr>
           <w:rFonts w:ascii="Times New Roman" w:hAnsi="Times New Roman" w:cs="Times New Roman"/>
-          <w:bCs/>
+          <w:b/>
           <w:sz w:val="24"/>
           <w:szCs w:val="24"/>
         </w:rPr>
@@ -2535,7 +2510,7 @@
       <w:r>
         <w:rPr>
           <w:rFonts w:ascii="Times New Roman" w:hAnsi="Times New Roman" w:cs="Times New Roman"/>
-          <w:bCs/>
+          <w:b/>
           <w:sz w:val="24"/>
           <w:szCs w:val="24"/>
         </w:rPr>
@@ -2547,6 +2522,7 @@
         <w:rPr>
           <w:rFonts w:ascii="Times New Roman" w:hAnsi="Times New Roman" w:cs="Times New Roman"/>
           <w:b/>
+          <w:bCs/>
           <w:sz w:val="24"/>
           <w:szCs w:val="24"/>
         </w:rPr>
@@ -2588,6 +2564,8 @@
       <w:r>
         <w:rPr>
           <w:rFonts w:ascii="Times New Roman" w:hAnsi="Times New Roman" w:cs="Times New Roman"/>
+          <w:b/>
+          <w:bCs/>
           <w:sz w:val="24"/>
           <w:szCs w:val="24"/>
           <w:lang w:val="id-ID"/>
@@ -2598,6 +2576,8 @@
       <w:r>
         <w:rPr>
           <w:rFonts w:ascii="Times New Roman" w:hAnsi="Times New Roman" w:cs="Times New Roman"/>
+          <w:b/>
+          <w:bCs/>
           <w:sz w:val="24"/>
           <w:szCs w:val="24"/>
           <w:lang w:val="id-ID"/>
@@ -2608,6 +2588,8 @@
       <w:r>
         <w:rPr>
           <w:rFonts w:ascii="Times New Roman" w:hAnsi="Times New Roman" w:cs="Times New Roman"/>
+          <w:b/>
+          <w:bCs/>
           <w:sz w:val="24"/>
           <w:szCs w:val="24"/>
           <w:lang w:val="id-ID"/>

</xml_diff>